<commit_message>
add patient psychological test workflow
</commit_message>
<xml_diff>
--- a/Informes/informe-brechas-y-oportunidades-app-psicologos.docx
+++ b/Informes/informe-brechas-y-oportunidades-app-psicologos.docx
@@ -12,7 +12,27 @@
     </w:p>
     <w:p>
       <w:r>
-        <w:t>Fuente principal: Reuniones/Reunion1.txt Contraste técnico: desarrollo actual del proyecto en backend/ y frontend/ Fecha base de la reunión: 04/06/2026 Participantes: Lina Barraza, Benjamín Valenzuela, Paulo Valenzuela, Matías Valenzuela Objetivo del documento: identificar qué ideas de la reunión potencian la aplicación actual, qué ya está construido, qué no existe todavía y qué conviene implementar primero.</w:t>
+        <w:t>**Fuente principal:** `Reuniones/Reunion1.txt`</w:t>
+      </w:r>
+    </w:p>
+    <w:p>
+      <w:r>
+        <w:t>**Contraste técnico:** desarrollo actual del proyecto en `backend/` y `frontend/`</w:t>
+      </w:r>
+    </w:p>
+    <w:p>
+      <w:r>
+        <w:t>**Fecha base de la reunión:** 04/06/2026</w:t>
+      </w:r>
+    </w:p>
+    <w:p>
+      <w:r>
+        <w:t>**Participantes:** Lina Barraza, Benjamín Valenzuela, Paulo Valenzuela, Matías Valenzuela</w:t>
+      </w:r>
+    </w:p>
+    <w:p>
+      <w:r>
+        <w:t>**Objetivo del documento:** identificar qué ideas de la reunión potencian la aplicación actual, qué ya está construido, qué no existe todavía y qué conviene implementar primero.</w:t>
       </w:r>
     </w:p>
     <w:p>
@@ -146,7 +166,7 @@
     </w:p>
     <w:p>
       <w:r>
-        <w:t>La app ya tiene modelo Paciente en backend/pacientes/models.py.</w:t>
+        <w:t>La app ya tiene modelo `Paciente` en `backend/pacientes/models.py`.</w:t>
       </w:r>
     </w:p>
     <w:p>
@@ -252,12 +272,12 @@
     </w:p>
     <w:p>
       <w:r>
-        <w:t>La pantalla principal frontend/src/app/dashboard/page.tsx permite listar pacientes, buscar por nombre o apellido y crear un paciente con campos básicos.</w:t>
-      </w:r>
-    </w:p>
-    <w:p>
-      <w:r>
-        <w:t>La pantalla de detalle frontend/src/app/dashboard/pacientes/[id]/page.tsx permite ver y editar datos básicos del paciente.</w:t>
+        <w:t>La pantalla principal `frontend/src/app/dashboard/page.tsx` permite listar pacientes, buscar por nombre o apellido y crear un paciente con campos básicos.</w:t>
+      </w:r>
+    </w:p>
+    <w:p>
+      <w:r>
+        <w:t>La pantalla de detalle `frontend/src/app/dashboard/pacientes/[id]/page.tsx` permite ver y editar datos básicos del paciente.</w:t>
       </w:r>
     </w:p>
     <w:p>
@@ -270,7 +290,7 @@
     </w:p>
     <w:p>
       <w:r>
-        <w:t>La app ya tiene modelo Sesion en backend/sesiones/models.py.</w:t>
+        <w:t>La app ya tiene modelo `Sesion` en `backend/sesiones/models.py`.</w:t>
       </w:r>
     </w:p>
     <w:p>
@@ -283,23 +303,23 @@
         <w:pStyle w:val="ListBullet"/>
       </w:pPr>
       <w:r>
-        <w:t>AUDIO: sesión grabada/presencial.</w:t>
-      </w:r>
-    </w:p>
-    <w:p>
-      <w:pPr>
-        <w:pStyle w:val="ListBullet"/>
-      </w:pPr>
-      <w:r>
-        <w:t>DOCUMENTO_EXTERNO: documento cargado y tratado como contexto.</w:t>
-      </w:r>
-    </w:p>
-    <w:p>
-      <w:pPr>
-        <w:pStyle w:val="ListBullet"/>
-      </w:pPr>
-      <w:r>
-        <w:t>VIRTUAL: sesión virtual capturada desde Meet/Zoom.</w:t>
+        <w:t>`AUDIO`: sesión grabada/presencial.</w:t>
+      </w:r>
+    </w:p>
+    <w:p>
+      <w:pPr>
+        <w:pStyle w:val="ListBullet"/>
+      </w:pPr>
+      <w:r>
+        <w:t>`DOCUMENTO_EXTERNO`: documento cargado y tratado como contexto.</w:t>
+      </w:r>
+    </w:p>
+    <w:p>
+      <w:pPr>
+        <w:pStyle w:val="ListBullet"/>
+      </w:pPr>
+      <w:r>
+        <w:t>`VIRTUAL`: sesión virtual capturada desde Meet/Zoom.</w:t>
       </w:r>
     </w:p>
     <w:p>
@@ -450,7 +470,7 @@
     </w:p>
     <w:p>
       <w:r>
-        <w:t>La app ya tiene TranscripcionSegmento con:</w:t>
+        <w:t>La app ya tiene `TranscripcionSegmento` con:</w:t>
       </w:r>
     </w:p>
     <w:p>
@@ -519,7 +539,7 @@
     </w:p>
     <w:p>
       <w:r>
-        <w:t>También existe SpeakerIdentificationResult, que registra resultados de identificación de hablantes mediante perfil de voz.</w:t>
+        <w:t>También existe `SpeakerIdentificationResult`, que registra resultados de identificación de hablantes mediante perfil de voz.</w:t>
       </w:r>
     </w:p>
     <w:p>
@@ -532,7 +552,7 @@
     </w:p>
     <w:p>
       <w:r>
-        <w:t>La app ya tiene VoiceProfile en backend/voz/models.py.</w:t>
+        <w:t>La app ya tiene `VoiceProfile` en `backend/voz/models.py`.</w:t>
       </w:r>
     </w:p>
     <w:p>
@@ -550,7 +570,7 @@
     </w:p>
     <w:p>
       <w:r>
-        <w:t>La app ya tiene conversaciones IA en backend/chat/models.py y backend/chat/views.py.</w:t>
+        <w:t>La app ya tiene conversaciones IA en `backend/chat/models.py` y `backend/chat/views.py`.</w:t>
       </w:r>
     </w:p>
     <w:p>
@@ -642,379 +662,61 @@
         <w:t>La diferencia es esta:</w:t>
       </w:r>
     </w:p>
-    <w:tbl>
-      <w:tblPr>
-        <w:tblStyle w:val="TableGrid"/>
-        <w:tblW w:type="auto" w:w="0"/>
-        <w:tblLook w:firstColumn="1" w:firstRow="1" w:lastColumn="0" w:lastRow="0" w:noHBand="0" w:noVBand="1" w:val="04A0"/>
-      </w:tblPr>
-      <w:tblGrid>
-        <w:gridCol w:w="2880"/>
-        <w:gridCol w:w="2880"/>
-        <w:gridCol w:w="2880"/>
-      </w:tblGrid>
-      <w:tr>
-        <w:tc>
-          <w:tcPr>
-            <w:tcW w:type="dxa" w:w="2880"/>
-          </w:tcPr>
-          <w:p>
-            <w:r>
-              <w:rPr>
-                <w:b/>
-              </w:rPr>
-              <w:t>Dimensión</w:t>
-            </w:r>
-          </w:p>
-        </w:tc>
-        <w:tc>
-          <w:tcPr>
-            <w:tcW w:type="dxa" w:w="2880"/>
-          </w:tcPr>
-          <w:p>
-            <w:r>
-              <w:rPr>
-                <w:b/>
-              </w:rPr>
-              <w:t>Estado actual</w:t>
-            </w:r>
-          </w:p>
-        </w:tc>
-        <w:tc>
-          <w:tcPr>
-            <w:tcW w:type="dxa" w:w="2880"/>
-          </w:tcPr>
-          <w:p>
-            <w:r>
-              <w:rPr>
-                <w:b/>
-              </w:rPr>
-              <w:t>Oportunidad detectada</w:t>
-            </w:r>
-          </w:p>
-        </w:tc>
-      </w:tr>
-      <w:tr>
-        <w:tc>
-          <w:tcPr>
-            <w:tcW w:type="dxa" w:w="2880"/>
-          </w:tcPr>
-          <w:p>
-            <w:r>
-              <w:t>Pacientes</w:t>
-            </w:r>
-          </w:p>
-        </w:tc>
-        <w:tc>
-          <w:tcPr>
-            <w:tcW w:type="dxa" w:w="2880"/>
-          </w:tcPr>
-          <w:p>
-            <w:r>
-              <w:t>Ficha básica</w:t>
-            </w:r>
-          </w:p>
-        </w:tc>
-        <w:tc>
-          <w:tcPr>
-            <w:tcW w:type="dxa" w:w="2880"/>
-          </w:tcPr>
-          <w:p>
-            <w:r>
-              <w:t>Ficha clínica, administrativa y de riesgo mucho más completa</w:t>
-            </w:r>
-          </w:p>
-        </w:tc>
-      </w:tr>
-      <w:tr>
-        <w:tc>
-          <w:tcPr>
-            <w:tcW w:type="dxa" w:w="2880"/>
-          </w:tcPr>
-          <w:p>
-            <w:r>
-              <w:t>Sesiones</w:t>
-            </w:r>
-          </w:p>
-        </w:tc>
-        <w:tc>
-          <w:tcPr>
-            <w:tcW w:type="dxa" w:w="2880"/>
-          </w:tcPr>
-          <w:p>
-            <w:r>
-              <w:t>Grabación, virtual, documentos, notas y transcripción</w:t>
-            </w:r>
-          </w:p>
-        </w:tc>
-        <w:tc>
-          <w:tcPr>
-            <w:tcW w:type="dxa" w:w="2880"/>
-          </w:tcPr>
-          <w:p>
-            <w:r>
-              <w:t>Número correlativo, objetivos, técnica, desarrollo, próxima sesión e hitos</w:t>
-            </w:r>
-          </w:p>
-        </w:tc>
-      </w:tr>
-      <w:tr>
-        <w:tc>
-          <w:tcPr>
-            <w:tcW w:type="dxa" w:w="2880"/>
-          </w:tcPr>
-          <w:p>
-            <w:r>
-              <w:t>IA</w:t>
-            </w:r>
-          </w:p>
-        </w:tc>
-        <w:tc>
-          <w:tcPr>
-            <w:tcW w:type="dxa" w:w="2880"/>
-          </w:tcPr>
-          <w:p>
-            <w:r>
-              <w:t>Chat contextual por segmentos</w:t>
-            </w:r>
-          </w:p>
-        </w:tc>
-        <w:tc>
-          <w:tcPr>
-            <w:tcW w:type="dxa" w:w="2880"/>
-          </w:tcPr>
-          <w:p>
-            <w:r>
-              <w:t>Informes estructurados, persistentes, con objetivos, tests y DSM-5</w:t>
-            </w:r>
-          </w:p>
-        </w:tc>
-      </w:tr>
-      <w:tr>
-        <w:tc>
-          <w:tcPr>
-            <w:tcW w:type="dxa" w:w="2880"/>
-          </w:tcPr>
-          <w:p>
-            <w:r>
-              <w:t>Tests</w:t>
-            </w:r>
-          </w:p>
-        </w:tc>
-        <w:tc>
-          <w:tcPr>
-            <w:tcW w:type="dxa" w:w="2880"/>
-          </w:tcPr>
-          <w:p>
-            <w:r>
-              <w:t>No existe módulo de tests</w:t>
-            </w:r>
-          </w:p>
-        </w:tc>
-        <w:tc>
-          <w:tcPr>
-            <w:tcW w:type="dxa" w:w="2880"/>
-          </w:tcPr>
-          <w:p>
-            <w:r>
-              <w:t>Digitalizar tests, calcular puntajes y asociarlos al paciente</w:t>
-            </w:r>
-          </w:p>
-        </w:tc>
-      </w:tr>
-      <w:tr>
-        <w:tc>
-          <w:tcPr>
-            <w:tcW w:type="dxa" w:w="2880"/>
-          </w:tcPr>
-          <w:p>
-            <w:r>
-              <w:t>Agenda</w:t>
-            </w:r>
-          </w:p>
-        </w:tc>
-        <w:tc>
-          <w:tcPr>
-            <w:tcW w:type="dxa" w:w="2880"/>
-          </w:tcPr>
-          <w:p>
-            <w:r>
-              <w:t>No hay agenda clínica completa</w:t>
-            </w:r>
-          </w:p>
-        </w:tc>
-        <w:tc>
-          <w:tcPr>
-            <w:tcW w:type="dxa" w:w="2880"/>
-          </w:tcPr>
-          <w:p>
-            <w:r>
-              <w:t>Calendario, frecuencia, recordatorios y estado de sesión</w:t>
-            </w:r>
-          </w:p>
-        </w:tc>
-      </w:tr>
-      <w:tr>
-        <w:tc>
-          <w:tcPr>
-            <w:tcW w:type="dxa" w:w="2880"/>
-          </w:tcPr>
-          <w:p>
-            <w:r>
-              <w:t>Pagos</w:t>
-            </w:r>
-          </w:p>
-        </w:tc>
-        <w:tc>
-          <w:tcPr>
-            <w:tcW w:type="dxa" w:w="2880"/>
-          </w:tcPr>
-          <w:p>
-            <w:r>
-              <w:t>No hay módulo de pagos</w:t>
-            </w:r>
-          </w:p>
-        </w:tc>
-        <w:tc>
-          <w:tcPr>
-            <w:tcW w:type="dxa" w:w="2880"/>
-          </w:tcPr>
-          <w:p>
-            <w:r>
-              <w:t>Registro de pagos, tarifas diferenciadas, deuda y boleta pendiente</w:t>
-            </w:r>
-          </w:p>
-        </w:tc>
-      </w:tr>
-      <w:tr>
-        <w:tc>
-          <w:tcPr>
-            <w:tcW w:type="dxa" w:w="2880"/>
-          </w:tcPr>
-          <w:p>
-            <w:r>
-              <w:t>Consentimiento</w:t>
-            </w:r>
-          </w:p>
-        </w:tc>
-        <w:tc>
-          <w:tcPr>
-            <w:tcW w:type="dxa" w:w="2880"/>
-          </w:tcPr>
-          <w:p>
-            <w:r>
-              <w:t>No se ve modelo de consentimiento</w:t>
-            </w:r>
-          </w:p>
-        </w:tc>
-        <w:tc>
-          <w:tcPr>
-            <w:tcW w:type="dxa" w:w="2880"/>
-          </w:tcPr>
-          <w:p>
-            <w:r>
-              <w:t>Consentimiento informado y permiso de grabación/transcripción</w:t>
-            </w:r>
-          </w:p>
-        </w:tc>
-      </w:tr>
-      <w:tr>
-        <w:tc>
-          <w:tcPr>
-            <w:tcW w:type="dxa" w:w="2880"/>
-          </w:tcPr>
-          <w:p>
-            <w:r>
-              <w:t>Analítica</w:t>
-            </w:r>
-          </w:p>
-        </w:tc>
-        <w:tc>
-          <w:tcPr>
-            <w:tcW w:type="dxa" w:w="2880"/>
-          </w:tcPr>
-          <w:p>
-            <w:r>
-              <w:t>No hay dashboard de negocio</w:t>
-            </w:r>
-          </w:p>
-        </w:tc>
-        <w:tc>
-          <w:tcPr>
-            <w:tcW w:type="dxa" w:w="2880"/>
-          </w:tcPr>
-          <w:p>
-            <w:r>
-              <w:t>Origen de pacientes, ingresos, uso de tests y evolución</w:t>
-            </w:r>
-          </w:p>
-        </w:tc>
-      </w:tr>
-      <w:tr>
-        <w:tc>
-          <w:tcPr>
-            <w:tcW w:type="dxa" w:w="2880"/>
-          </w:tcPr>
-          <w:p>
-            <w:r>
-              <w:t>Personalización</w:t>
-            </w:r>
-          </w:p>
-        </w:tc>
-        <w:tc>
-          <w:tcPr>
-            <w:tcW w:type="dxa" w:w="2880"/>
-          </w:tcPr>
-          <w:p>
-            <w:r>
-              <w:t>No hay listas configurables por psicólogo</w:t>
-            </w:r>
-          </w:p>
-        </w:tc>
-        <w:tc>
-          <w:tcPr>
-            <w:tcW w:type="dxa" w:w="2880"/>
-          </w:tcPr>
-          <w:p>
-            <w:r>
-              <w:t>Categorías propias: valores, heridas, técnicas, temas, áreas</w:t>
-            </w:r>
-          </w:p>
-        </w:tc>
-      </w:tr>
-      <w:tr>
-        <w:tc>
-          <w:tcPr>
-            <w:tcW w:type="dxa" w:w="2880"/>
-          </w:tcPr>
-          <w:p>
-            <w:r>
-              <w:t>Producto comercial</w:t>
-            </w:r>
-          </w:p>
-        </w:tc>
-        <w:tc>
-          <w:tcPr>
-            <w:tcW w:type="dxa" w:w="2880"/>
-          </w:tcPr>
-          <w:p>
-            <w:r>
-              <w:t>App en beta funcional</w:t>
-            </w:r>
-          </w:p>
-        </w:tc>
-        <w:tc>
-          <w:tcPr>
-            <w:tcW w:type="dxa" w:w="2880"/>
-          </w:tcPr>
-          <w:p>
-            <w:r>
-              <w:t>Plataforma de nicho para psicólogos con planes y add-ons</w:t>
-            </w:r>
-          </w:p>
-        </w:tc>
-      </w:tr>
-    </w:tbl>
+    <w:p>
+      <w:r>
+        <w:t>| Dimensión | Estado actual | Oportunidad detectada |</w:t>
+      </w:r>
+    </w:p>
+    <w:p>
+      <w:r>
+        <w:t>| Pacientes | Ficha básica | Ficha clínica, administrativa y de riesgo mucho más completa |</w:t>
+      </w:r>
+    </w:p>
+    <w:p>
+      <w:r>
+        <w:t>| Sesiones | Grabación, virtual, documentos, notas y transcripción | Número correlativo, objetivos, técnica, desarrollo, próxima sesión e hitos |</w:t>
+      </w:r>
+    </w:p>
+    <w:p>
+      <w:r>
+        <w:t>| IA | Chat contextual por segmentos | Informes estructurados, persistentes, con objetivos, tests y DSM-5 |</w:t>
+      </w:r>
+    </w:p>
+    <w:p>
+      <w:r>
+        <w:t>| Tests | No existe módulo de tests | Digitalizar tests, calcular puntajes y asociarlos al paciente |</w:t>
+      </w:r>
+    </w:p>
+    <w:p>
+      <w:r>
+        <w:t>| Agenda | No hay agenda clínica completa | Calendario, frecuencia, recordatorios y estado de sesión |</w:t>
+      </w:r>
+    </w:p>
+    <w:p>
+      <w:r>
+        <w:t>| Pagos | No hay módulo de pagos | Registro de pagos, tarifas diferenciadas, deuda y boleta pendiente |</w:t>
+      </w:r>
+    </w:p>
+    <w:p>
+      <w:r>
+        <w:t>| Consentimiento | No se ve modelo de consentimiento | Consentimiento informado y permiso de grabación/transcripción |</w:t>
+      </w:r>
+    </w:p>
+    <w:p>
+      <w:r>
+        <w:t>| Analítica | No hay dashboard de negocio | Origen de pacientes, ingresos, uso de tests y evolución |</w:t>
+      </w:r>
+    </w:p>
+    <w:p>
+      <w:r>
+        <w:t>| Personalización | No hay listas configurables por psicólogo | Categorías propias: valores, heridas, técnicas, temas, áreas |</w:t>
+      </w:r>
+    </w:p>
+    <w:p>
+      <w:r>
+        <w:t>| Producto comercial | App en beta funcional | Plataforma de nicho para psicólogos con planes y add-ons |</w:t>
+      </w:r>
+    </w:p>
     <w:p>
       <w:pPr>
         <w:pStyle w:val="Heading2"/>
@@ -1152,17 +854,17 @@
     </w:p>
     <w:p>
       <w:r>
-        <w:t>Estado actual: la ficha tiene datos básicos: nombre, apellido, RUT, fecha de nacimiento, edad, sexo, ocupación, motivo de consulta y notas privadas.</w:t>
-      </w:r>
-    </w:p>
-    <w:p>
-      <w:r>
-        <w:t>Hallazgo de la reunión: Lina usa muchos más datos en su ficha real. Algunos son clínicos, otros administrativos y otros de seguridad.</w:t>
-      </w:r>
-    </w:p>
-    <w:p>
-      <w:r>
-        <w:t>Oportunidad: transformar la ficha actual en una ficha clínica psicológica más completa, organizada por secciones.</w:t>
+        <w:t>**Estado actual:** la ficha tiene datos básicos: nombre, apellido, RUT, fecha de nacimiento, edad, sexo, ocupación, motivo de consulta y notas privadas.</w:t>
+      </w:r>
+    </w:p>
+    <w:p>
+      <w:r>
+        <w:t>**Hallazgo de la reunión:** Lina usa muchos más datos en su ficha real. Algunos son clínicos, otros administrativos y otros de seguridad.</w:t>
+      </w:r>
+    </w:p>
+    <w:p>
+      <w:r>
+        <w:t>**Oportunidad:** transformar la ficha actual en una ficha clínica psicológica más completa, organizada por secciones.</w:t>
       </w:r>
     </w:p>
     <w:p>
@@ -1170,515 +872,124 @@
         <w:t>Campos nuevos recomendados:</w:t>
       </w:r>
     </w:p>
-    <w:tbl>
-      <w:tblPr>
-        <w:tblStyle w:val="TableGrid"/>
-        <w:tblW w:type="auto" w:w="0"/>
-        <w:tblLook w:firstColumn="1" w:firstRow="1" w:lastColumn="0" w:lastRow="0" w:noHBand="0" w:noVBand="1" w:val="04A0"/>
-      </w:tblPr>
-      <w:tblGrid>
-        <w:gridCol w:w="4320"/>
-        <w:gridCol w:w="4320"/>
-      </w:tblGrid>
-      <w:tr>
-        <w:tc>
-          <w:tcPr>
-            <w:tcW w:type="dxa" w:w="4320"/>
-          </w:tcPr>
-          <w:p>
-            <w:r>
-              <w:rPr>
-                <w:b/>
-              </w:rPr>
-              <w:t>Campo</w:t>
-            </w:r>
-          </w:p>
-        </w:tc>
-        <w:tc>
-          <w:tcPr>
-            <w:tcW w:type="dxa" w:w="4320"/>
-          </w:tcPr>
-          <w:p>
-            <w:r>
-              <w:rPr>
-                <w:b/>
-              </w:rPr>
-              <w:t>Razón clínica o administrativa</w:t>
-            </w:r>
-          </w:p>
-        </w:tc>
-      </w:tr>
-      <w:tr>
-        <w:tc>
-          <w:tcPr>
-            <w:tcW w:type="dxa" w:w="4320"/>
-          </w:tcPr>
-          <w:p>
-            <w:r>
-              <w:t>WhatsApp</w:t>
-            </w:r>
-          </w:p>
-        </w:tc>
-        <w:tc>
-          <w:tcPr>
-            <w:tcW w:type="dxa" w:w="4320"/>
-          </w:tcPr>
-          <w:p>
-            <w:r>
-              <w:t>Medio práctico de contacto frecuente</w:t>
-            </w:r>
-          </w:p>
-        </w:tc>
-      </w:tr>
-      <w:tr>
-        <w:tc>
-          <w:tcPr>
-            <w:tcW w:type="dxa" w:w="4320"/>
-          </w:tcPr>
-          <w:p>
-            <w:r>
-              <w:t>Correo</w:t>
-            </w:r>
-          </w:p>
-        </w:tc>
-        <w:tc>
-          <w:tcPr>
-            <w:tcW w:type="dxa" w:w="4320"/>
-          </w:tcPr>
-          <w:p>
-            <w:r>
-              <w:t>Comunicación y envío de links/tests</w:t>
-            </w:r>
-          </w:p>
-        </w:tc>
-      </w:tr>
-      <w:tr>
-        <w:tc>
-          <w:tcPr>
-            <w:tcW w:type="dxa" w:w="4320"/>
-          </w:tcPr>
-          <w:p>
-            <w:r>
-              <w:t>Nacionalidad</w:t>
-            </w:r>
-          </w:p>
-        </w:tc>
-        <w:tc>
-          <w:tcPr>
-            <w:tcW w:type="dxa" w:w="4320"/>
-          </w:tcPr>
-          <w:p>
-            <w:r>
-              <w:t>Contexto y registro</w:t>
-            </w:r>
-          </w:p>
-        </w:tc>
-      </w:tr>
-      <w:tr>
-        <w:tc>
-          <w:tcPr>
-            <w:tcW w:type="dxa" w:w="4320"/>
-          </w:tcPr>
-          <w:p>
-            <w:r>
-              <w:t>Religión</w:t>
-            </w:r>
-          </w:p>
-        </w:tc>
-        <w:tc>
-          <w:tcPr>
-            <w:tcW w:type="dxa" w:w="4320"/>
-          </w:tcPr>
-          <w:p>
-            <w:r>
-              <w:t>Relevante para algunos enfoques o procesos</w:t>
-            </w:r>
-          </w:p>
-        </w:tc>
-      </w:tr>
-      <w:tr>
-        <w:tc>
-          <w:tcPr>
-            <w:tcW w:type="dxa" w:w="4320"/>
-          </w:tcPr>
-          <w:p>
-            <w:r>
-              <w:t>Dirección actual</w:t>
-            </w:r>
-          </w:p>
-        </w:tc>
-        <w:tc>
-          <w:tcPr>
-            <w:tcW w:type="dxa" w:w="4320"/>
-          </w:tcPr>
-          <w:p>
-            <w:r>
-              <w:t>Registro administrativo</w:t>
-            </w:r>
-          </w:p>
-        </w:tc>
-      </w:tr>
-      <w:tr>
-        <w:tc>
-          <w:tcPr>
-            <w:tcW w:type="dxa" w:w="4320"/>
-          </w:tcPr>
-          <w:p>
-            <w:r>
-              <w:t>Comuna</w:t>
-            </w:r>
-          </w:p>
-        </w:tc>
-        <w:tc>
-          <w:tcPr>
-            <w:tcW w:type="dxa" w:w="4320"/>
-          </w:tcPr>
-          <w:p>
-            <w:r>
-              <w:t>Segmentación y contexto</w:t>
-            </w:r>
-          </w:p>
-        </w:tc>
-      </w:tr>
-      <w:tr>
-        <w:tc>
-          <w:tcPr>
-            <w:tcW w:type="dxa" w:w="4320"/>
-          </w:tcPr>
-          <w:p>
-            <w:r>
-              <w:t>Previsión</w:t>
-            </w:r>
-          </w:p>
-        </w:tc>
-        <w:tc>
-          <w:tcPr>
-            <w:tcW w:type="dxa" w:w="4320"/>
-          </w:tcPr>
-          <w:p>
-            <w:r>
-              <w:t>Dato administrativo usado por psicólogos/centros</w:t>
-            </w:r>
-          </w:p>
-        </w:tc>
-      </w:tr>
-      <w:tr>
-        <w:tc>
-          <w:tcPr>
-            <w:tcW w:type="dxa" w:w="4320"/>
-          </w:tcPr>
-          <w:p>
-            <w:r>
-              <w:t>Menor de edad</w:t>
-            </w:r>
-          </w:p>
-        </w:tc>
-        <w:tc>
-          <w:tcPr>
-            <w:tcW w:type="dxa" w:w="4320"/>
-          </w:tcPr>
-          <w:p>
-            <w:r>
-              <w:t>Activa datos de tutor/responsable</w:t>
-            </w:r>
-          </w:p>
-        </w:tc>
-      </w:tr>
-      <w:tr>
-        <w:tc>
-          <w:tcPr>
-            <w:tcW w:type="dxa" w:w="4320"/>
-          </w:tcPr>
-          <w:p>
-            <w:r>
-              <w:t>Tutor o responsable</w:t>
-            </w:r>
-          </w:p>
-        </w:tc>
-        <w:tc>
-          <w:tcPr>
-            <w:tcW w:type="dxa" w:w="4320"/>
-          </w:tcPr>
-          <w:p>
-            <w:r>
-              <w:t>Necesario si el paciente es menor</w:t>
-            </w:r>
-          </w:p>
-        </w:tc>
-      </w:tr>
-      <w:tr>
-        <w:tc>
-          <w:tcPr>
-            <w:tcW w:type="dxa" w:w="4320"/>
-          </w:tcPr>
-          <w:p>
-            <w:r>
-              <w:t>Persona de confianza</w:t>
-            </w:r>
-          </w:p>
-        </w:tc>
-        <w:tc>
-          <w:tcPr>
-            <w:tcW w:type="dxa" w:w="4320"/>
-          </w:tcPr>
-          <w:p>
-            <w:r>
-              <w:t>Relevante por riesgo o emergencia</w:t>
-            </w:r>
-          </w:p>
-        </w:tc>
-      </w:tr>
-      <w:tr>
-        <w:tc>
-          <w:tcPr>
-            <w:tcW w:type="dxa" w:w="4320"/>
-          </w:tcPr>
-          <w:p>
-            <w:r>
-              <w:t>Contacto de emergencia</w:t>
-            </w:r>
-          </w:p>
-        </w:tc>
-        <w:tc>
-          <w:tcPr>
-            <w:tcW w:type="dxa" w:w="4320"/>
-          </w:tcPr>
-          <w:p>
-            <w:r>
-              <w:t>Crítico ante ideación suicida o riesgo</w:t>
-            </w:r>
-          </w:p>
-        </w:tc>
-      </w:tr>
-      <w:tr>
-        <w:tc>
-          <w:tcPr>
-            <w:tcW w:type="dxa" w:w="4320"/>
-          </w:tcPr>
-          <w:p>
-            <w:r>
-              <w:t>Derivación o interconsulta</w:t>
-            </w:r>
-          </w:p>
-        </w:tc>
-        <w:tc>
-          <w:tcPr>
-            <w:tcW w:type="dxa" w:w="4320"/>
-          </w:tcPr>
-          <w:p>
-            <w:r>
-              <w:t>Permite registrar origen clínico</w:t>
-            </w:r>
-          </w:p>
-        </w:tc>
-      </w:tr>
-      <w:tr>
-        <w:tc>
-          <w:tcPr>
-            <w:tcW w:type="dxa" w:w="4320"/>
-          </w:tcPr>
-          <w:p>
-            <w:r>
-              <w:t>Origen comercial</w:t>
-            </w:r>
-          </w:p>
-        </w:tc>
-        <w:tc>
-          <w:tcPr>
-            <w:tcW w:type="dxa" w:w="4320"/>
-          </w:tcPr>
-          <w:p>
-            <w:r>
-              <w:t>Instagram, referido, CAF, boca a boca, otro</w:t>
-            </w:r>
-          </w:p>
-        </w:tc>
-      </w:tr>
-      <w:tr>
-        <w:tc>
-          <w:tcPr>
-            <w:tcW w:type="dxa" w:w="4320"/>
-          </w:tcPr>
-          <w:p>
-            <w:r>
-              <w:t>Diagnóstico sospechado</w:t>
-            </w:r>
-          </w:p>
-        </w:tc>
-        <w:tc>
-          <w:tcPr>
-            <w:tcW w:type="dxa" w:w="4320"/>
-          </w:tcPr>
-          <w:p>
-            <w:r>
-              <w:t>Hipótesis inicial del profesional</w:t>
-            </w:r>
-          </w:p>
-        </w:tc>
-      </w:tr>
-      <w:tr>
-        <w:tc>
-          <w:tcPr>
-            <w:tcW w:type="dxa" w:w="4320"/>
-          </w:tcPr>
-          <w:p>
-            <w:r>
-              <w:t>Problemática principal</w:t>
-            </w:r>
-          </w:p>
-        </w:tc>
-        <w:tc>
-          <w:tcPr>
-            <w:tcW w:type="dxa" w:w="4320"/>
-          </w:tcPr>
-          <w:p>
-            <w:r>
-              <w:t>Motivo clínico más estructurado</w:t>
-            </w:r>
-          </w:p>
-        </w:tc>
-      </w:tr>
-      <w:tr>
-        <w:tc>
-          <w:tcPr>
-            <w:tcW w:type="dxa" w:w="4320"/>
-          </w:tcPr>
-          <w:p>
-            <w:r>
-              <w:t>Medicación actual</w:t>
-            </w:r>
-          </w:p>
-        </w:tc>
-        <w:tc>
-          <w:tcPr>
-            <w:tcW w:type="dxa" w:w="4320"/>
-          </w:tcPr>
-          <w:p>
-            <w:r>
-              <w:t>Dato relevante para seguimiento</w:t>
-            </w:r>
-          </w:p>
-        </w:tc>
-      </w:tr>
-      <w:tr>
-        <w:tc>
-          <w:tcPr>
-            <w:tcW w:type="dxa" w:w="4320"/>
-          </w:tcPr>
-          <w:p>
-            <w:r>
-              <w:t>Riesgo suicida</w:t>
-            </w:r>
-          </w:p>
-        </w:tc>
-        <w:tc>
-          <w:tcPr>
-            <w:tcW w:type="dxa" w:w="4320"/>
-          </w:tcPr>
-          <w:p>
-            <w:r>
-              <w:t>Campo de alerta crítica</w:t>
-            </w:r>
-          </w:p>
-        </w:tc>
-      </w:tr>
-      <w:tr>
-        <w:tc>
-          <w:tcPr>
-            <w:tcW w:type="dxa" w:w="4320"/>
-          </w:tcPr>
-          <w:p>
-            <w:r>
-              <w:t>Escala de ideación</w:t>
-            </w:r>
-          </w:p>
-        </w:tc>
-        <w:tc>
-          <w:tcPr>
-            <w:tcW w:type="dxa" w:w="4320"/>
-          </w:tcPr>
-          <w:p>
-            <w:r>
-              <w:t>Seguimiento simple de riesgo sesión a sesión</w:t>
-            </w:r>
-          </w:p>
-        </w:tc>
-      </w:tr>
-      <w:tr>
-        <w:tc>
-          <w:tcPr>
-            <w:tcW w:type="dxa" w:w="4320"/>
-          </w:tcPr>
-          <w:p>
-            <w:r>
-              <w:t>Frecuencia de atención</w:t>
-            </w:r>
-          </w:p>
-        </w:tc>
-        <w:tc>
-          <w:tcPr>
-            <w:tcW w:type="dxa" w:w="4320"/>
-          </w:tcPr>
-          <w:p>
-            <w:r>
-              <w:t>Semanal, quincenal, mensual, seguimiento</w:t>
-            </w:r>
-          </w:p>
-        </w:tc>
-      </w:tr>
-      <w:tr>
-        <w:tc>
-          <w:tcPr>
-            <w:tcW w:type="dxa" w:w="4320"/>
-          </w:tcPr>
-          <w:p>
-            <w:r>
-              <w:t>Tarifa diferenciada</w:t>
-            </w:r>
-          </w:p>
-        </w:tc>
-        <w:tc>
-          <w:tcPr>
-            <w:tcW w:type="dxa" w:w="4320"/>
-          </w:tcPr>
-          <w:p>
-            <w:r>
-              <w:t>Valor particular del paciente</w:t>
-            </w:r>
-          </w:p>
-        </w:tc>
-      </w:tr>
-      <w:tr>
-        <w:tc>
-          <w:tcPr>
-            <w:tcW w:type="dxa" w:w="4320"/>
-          </w:tcPr>
-          <w:p>
-            <w:r>
-              <w:t>Observaciones generales</w:t>
-            </w:r>
-          </w:p>
-        </w:tc>
-        <w:tc>
-          <w:tcPr>
-            <w:tcW w:type="dxa" w:w="4320"/>
-          </w:tcPr>
-          <w:p>
-            <w:r>
-              <w:t>Información transversal del proceso</w:t>
-            </w:r>
-          </w:p>
-        </w:tc>
-      </w:tr>
-    </w:tbl>
-    <w:p>
-      <w:r>
-        <w:t>Implementación sugerida: no poner todos los campos en un formulario largo. Usar secciones plegables: datos básicos, contacto, antecedentes clínicos, riesgo, administración y origen.</w:t>
-      </w:r>
-    </w:p>
-    <w:p>
-      <w:r>
-        <w:t>Prioridad: alta.</w:t>
+    <w:p>
+      <w:r>
+        <w:t>| Campo | Razón clínica o administrativa |</w:t>
+      </w:r>
+    </w:p>
+    <w:p>
+      <w:r>
+        <w:t>| WhatsApp | Medio práctico de contacto frecuente |</w:t>
+      </w:r>
+    </w:p>
+    <w:p>
+      <w:r>
+        <w:t>| Correo | Comunicación y envío de links/tests |</w:t>
+      </w:r>
+    </w:p>
+    <w:p>
+      <w:r>
+        <w:t>| Nacionalidad | Contexto y registro |</w:t>
+      </w:r>
+    </w:p>
+    <w:p>
+      <w:r>
+        <w:t>| Religión | Relevante para algunos enfoques o procesos |</w:t>
+      </w:r>
+    </w:p>
+    <w:p>
+      <w:r>
+        <w:t>| Dirección actual | Registro administrativo |</w:t>
+      </w:r>
+    </w:p>
+    <w:p>
+      <w:r>
+        <w:t>| Comuna | Segmentación y contexto |</w:t>
+      </w:r>
+    </w:p>
+    <w:p>
+      <w:r>
+        <w:t>| Previsión | Dato administrativo usado por psicólogos/centros |</w:t>
+      </w:r>
+    </w:p>
+    <w:p>
+      <w:r>
+        <w:t>| Menor de edad | Activa datos de tutor/responsable |</w:t>
+      </w:r>
+    </w:p>
+    <w:p>
+      <w:r>
+        <w:t>| Tutor o responsable | Necesario si el paciente es menor |</w:t>
+      </w:r>
+    </w:p>
+    <w:p>
+      <w:r>
+        <w:t>| Persona de confianza | Relevante por riesgo o emergencia |</w:t>
+      </w:r>
+    </w:p>
+    <w:p>
+      <w:r>
+        <w:t>| Contacto de emergencia | Crítico ante ideación suicida o riesgo |</w:t>
+      </w:r>
+    </w:p>
+    <w:p>
+      <w:r>
+        <w:t>| Derivación o interconsulta | Permite registrar origen clínico |</w:t>
+      </w:r>
+    </w:p>
+    <w:p>
+      <w:r>
+        <w:t>| Origen comercial | Instagram, referido, CAF, boca a boca, otro |</w:t>
+      </w:r>
+    </w:p>
+    <w:p>
+      <w:r>
+        <w:t>| Diagnóstico sospechado | Hipótesis inicial del profesional |</w:t>
+      </w:r>
+    </w:p>
+    <w:p>
+      <w:r>
+        <w:t>| Problemática principal | Motivo clínico más estructurado |</w:t>
+      </w:r>
+    </w:p>
+    <w:p>
+      <w:r>
+        <w:t>| Medicación actual | Dato relevante para seguimiento |</w:t>
+      </w:r>
+    </w:p>
+    <w:p>
+      <w:r>
+        <w:t>| Riesgo suicida | Campo de alerta crítica |</w:t>
+      </w:r>
+    </w:p>
+    <w:p>
+      <w:r>
+        <w:t>| Escala de ideación | Seguimiento simple de riesgo sesión a sesión |</w:t>
+      </w:r>
+    </w:p>
+    <w:p>
+      <w:r>
+        <w:t>| Frecuencia de atención | Semanal, quincenal, mensual, seguimiento |</w:t>
+      </w:r>
+    </w:p>
+    <w:p>
+      <w:r>
+        <w:t>| Tarifa diferenciada | Valor particular del paciente |</w:t>
+      </w:r>
+    </w:p>
+    <w:p>
+      <w:r>
+        <w:t>| Observaciones generales | Información transversal del proceso |</w:t>
+      </w:r>
+    </w:p>
+    <w:p>
+      <w:r>
+        <w:t>**Implementación sugerida:** no poner todos los campos en un formulario largo. Usar secciones plegables: datos básicos, contacto, antecedentes clínicos, riesgo, administración y origen.</w:t>
+      </w:r>
+    </w:p>
+    <w:p>
+      <w:r>
+        <w:t>**Prioridad:** alta.</w:t>
       </w:r>
     </w:p>
     <w:p>
@@ -1691,17 +1002,17 @@
     </w:p>
     <w:p>
       <w:r>
-        <w:t>Estado actual: no se observó un modelo específico para consentimiento informado.</w:t>
-      </w:r>
-    </w:p>
-    <w:p>
-      <w:r>
-        <w:t>Hallazgo de la reunión: Lina explicó que el consentimiento informado debe firmarse al inicio del proceso, especialmente si se grabará o transcribirá la sesión.</w:t>
-      </w:r>
-    </w:p>
-    <w:p>
-      <w:r>
-        <w:t>Oportunidad: agregar un módulo simple de consentimiento antes de escalar el uso de grabaciones.</w:t>
+        <w:t>**Estado actual:** no se observó un modelo específico para consentimiento informado.</w:t>
+      </w:r>
+    </w:p>
+    <w:p>
+      <w:r>
+        <w:t>**Hallazgo de la reunión:** Lina explicó que el consentimiento informado debe firmarse al inicio del proceso, especialmente si se grabará o transcribirá la sesión.</w:t>
+      </w:r>
+    </w:p>
+    <w:p>
+      <w:r>
+        <w:t>**Oportunidad:** agregar un módulo simple de consentimiento antes de escalar el uso de grabaciones.</w:t>
       </w:r>
     </w:p>
     <w:p>
@@ -1759,12 +1070,12 @@
     </w:p>
     <w:p>
       <w:r>
-        <w:t>Implementación sugerida: crear entidad ConsentimientoInformado asociada a paciente y psicólogo. En una primera versión puede ser un registro manual: “firmado”, fecha y observación.</w:t>
-      </w:r>
-    </w:p>
-    <w:p>
-      <w:r>
-        <w:t>Prioridad: alta por riesgo ético/legal.</w:t>
+        <w:t>**Implementación sugerida:** crear entidad `ConsentimientoInformado` asociada a paciente y psicólogo. En una primera versión puede ser un registro manual: “firmado”, fecha y observación.</w:t>
+      </w:r>
+    </w:p>
+    <w:p>
+      <w:r>
+        <w:t>**Prioridad:** alta por riesgo ético/legal.</w:t>
       </w:r>
     </w:p>
     <w:p>
@@ -1777,17 +1088,17 @@
     </w:p>
     <w:p>
       <w:r>
-        <w:t>Estado actual: las sesiones tienen fecha y estado, pero no se observó un campo explícito de número de sesión por paciente.</w:t>
-      </w:r>
-    </w:p>
-    <w:p>
-      <w:r>
-        <w:t>Hallazgo de la reunión: Lina indicó que hoy debe contar manualmente las sesiones y eso produce errores. Mencionó el caso de un paciente registrado como sesión 47 cuando ya iba en sesión 51.</w:t>
-      </w:r>
-    </w:p>
-    <w:p>
-      <w:r>
-        <w:t>Oportunidad: mostrar y guardar automáticamente Sesión 1, Sesión 2, Sesión 3 por paciente.</w:t>
+        <w:t>**Estado actual:** las sesiones tienen fecha y estado, pero no se observó un campo explícito de número de sesión por paciente.</w:t>
+      </w:r>
+    </w:p>
+    <w:p>
+      <w:r>
+        <w:t>**Hallazgo de la reunión:** Lina indicó que hoy debe contar manualmente las sesiones y eso produce errores. Mencionó el caso de un paciente registrado como sesión 47 cuando ya iba en sesión 51.</w:t>
+      </w:r>
+    </w:p>
+    <w:p>
+      <w:r>
+        <w:t>**Oportunidad:** mostrar y guardar automáticamente `Sesión 1`, `Sesión 2`, `Sesión 3` por paciente.</w:t>
       </w:r>
     </w:p>
     <w:p>
@@ -1837,12 +1148,12 @@
     </w:p>
     <w:p>
       <w:r>
-        <w:t>Implementación sugerida: agregar numero_sesion a Sesion, asignarlo según paciente al crear. Si se eliminan sesiones, evitar renumerar automáticamente para no alterar historial clínico.</w:t>
-      </w:r>
-    </w:p>
-    <w:p>
-      <w:r>
-        <w:t>Prioridad: muy alta por bajo esfuerzo y alto valor.</w:t>
+        <w:t>**Implementación sugerida:** agregar `numero_sesion` a `Sesion`, asignarlo según paciente al crear. Si se eliminan sesiones, evitar renumerar automáticamente para no alterar historial clínico.</w:t>
+      </w:r>
+    </w:p>
+    <w:p>
+      <w:r>
+        <w:t>**Prioridad:** muy alta por bajo esfuerzo y alto valor.</w:t>
       </w:r>
     </w:p>
     <w:p>
@@ -1855,17 +1166,17 @@
     </w:p>
     <w:p>
       <w:r>
-        <w:t>Estado actual: el paciente tiene motivo_consulta y la sesión tiene notas_sesion, pero no existe una estructura de objetivos terapéuticos.</w:t>
-      </w:r>
-    </w:p>
-    <w:p>
-      <w:r>
-        <w:t>Hallazgo de la reunión: Lina propuso registrar “proceso de intervención” u “objetivos de intervención” para luego pedirle a la IA qué se ha trabajado y qué falta.</w:t>
-      </w:r>
-    </w:p>
-    <w:p>
-      <w:r>
-        <w:t>Oportunidad: crear objetivos clínicos asociados al paciente y enlazarlos con sesiones.</w:t>
+        <w:t>**Estado actual:** el paciente tiene `motivo_consulta` y la sesión tiene `notas_sesion`, pero no existe una estructura de objetivos terapéuticos.</w:t>
+      </w:r>
+    </w:p>
+    <w:p>
+      <w:r>
+        <w:t>**Hallazgo de la reunión:** Lina propuso registrar “proceso de intervención” u “objetivos de intervención” para luego pedirle a la IA qué se ha trabajado y qué falta.</w:t>
+      </w:r>
+    </w:p>
+    <w:p>
+      <w:r>
+        <w:t>**Oportunidad:** crear objetivos clínicos asociados al paciente y enlazarlos con sesiones.</w:t>
       </w:r>
     </w:p>
     <w:p>
@@ -1915,12 +1226,12 @@
     </w:p>
     <w:p>
       <w:r>
-        <w:t>Implementación sugerida: partir con un campo texto largo objetivos_intervencion en paciente. Luego evolucionar a entidad separada ObjetivoIntervencion.</w:t>
-      </w:r>
-    </w:p>
-    <w:p>
-      <w:r>
-        <w:t>Prioridad: alta.</w:t>
+        <w:t>**Implementación sugerida:** partir con un campo texto largo `objetivos_intervencion` en paciente. Luego evolucionar a entidad separada `ObjetivoIntervencion`.</w:t>
+      </w:r>
+    </w:p>
+    <w:p>
+      <w:r>
+        <w:t>**Prioridad:** alta.</w:t>
       </w:r>
     </w:p>
     <w:p>
@@ -1933,247 +1244,77 @@
     </w:p>
     <w:p>
       <w:r>
-        <w:t>Estado actual: cada sesión tiene notas_sesion como texto libre.</w:t>
-      </w:r>
-    </w:p>
-    <w:p>
-      <w:r>
-        <w:t>Hallazgo de la reunión: Lina mostró que en Medilink existen campos como número de sesión, objetivo, técnica aplicada, desarrollo y objetivo de próxima sesión. Aunque Medilink no le parece amigable, esa estructura sí tiene valor.</w:t>
-      </w:r>
-    </w:p>
-    <w:p>
-      <w:r>
-        <w:t>Oportunidad: evolucionar notas_sesion hacia secciones clínicas opcionales.</w:t>
-      </w:r>
-    </w:p>
-    <w:p>
-      <w:r>
-        <w:t>Campos sugeridos para Sesion:</w:t>
-      </w:r>
-    </w:p>
-    <w:tbl>
-      <w:tblPr>
-        <w:tblStyle w:val="TableGrid"/>
-        <w:tblW w:type="auto" w:w="0"/>
-        <w:tblLook w:firstColumn="1" w:firstRow="1" w:lastColumn="0" w:lastRow="0" w:noHBand="0" w:noVBand="1" w:val="04A0"/>
-      </w:tblPr>
-      <w:tblGrid>
-        <w:gridCol w:w="4320"/>
-        <w:gridCol w:w="4320"/>
-      </w:tblGrid>
-      <w:tr>
-        <w:tc>
-          <w:tcPr>
-            <w:tcW w:type="dxa" w:w="4320"/>
-          </w:tcPr>
-          <w:p>
-            <w:r>
-              <w:rPr>
-                <w:b/>
-              </w:rPr>
-              <w:t>Campo</w:t>
-            </w:r>
-          </w:p>
-        </w:tc>
-        <w:tc>
-          <w:tcPr>
-            <w:tcW w:type="dxa" w:w="4320"/>
-          </w:tcPr>
-          <w:p>
-            <w:r>
-              <w:rPr>
-                <w:b/>
-              </w:rPr>
-              <w:t>Uso</w:t>
-            </w:r>
-          </w:p>
-        </w:tc>
-      </w:tr>
-      <w:tr>
-        <w:tc>
-          <w:tcPr>
-            <w:tcW w:type="dxa" w:w="4320"/>
-          </w:tcPr>
-          <w:p>
-            <w:r>
-              <w:t>numero_sesion</w:t>
-            </w:r>
-          </w:p>
-        </w:tc>
-        <w:tc>
-          <w:tcPr>
-            <w:tcW w:type="dxa" w:w="4320"/>
-          </w:tcPr>
-          <w:p>
-            <w:r>
-              <w:t>Correlativo por paciente</w:t>
-            </w:r>
-          </w:p>
-        </w:tc>
-      </w:tr>
-      <w:tr>
-        <w:tc>
-          <w:tcPr>
-            <w:tcW w:type="dxa" w:w="4320"/>
-          </w:tcPr>
-          <w:p>
-            <w:r>
-              <w:t>tema_sesion</w:t>
-            </w:r>
-          </w:p>
-        </w:tc>
-        <w:tc>
-          <w:tcPr>
-            <w:tcW w:type="dxa" w:w="4320"/>
-          </w:tcPr>
-          <w:p>
-            <w:r>
-              <w:t>Tema u objetivo principal</w:t>
-            </w:r>
-          </w:p>
-        </w:tc>
-      </w:tr>
-      <w:tr>
-        <w:tc>
-          <w:tcPr>
-            <w:tcW w:type="dxa" w:w="4320"/>
-          </w:tcPr>
-          <w:p>
-            <w:r>
-              <w:t>tecnica_aplicada</w:t>
-            </w:r>
-          </w:p>
-        </w:tc>
-        <w:tc>
-          <w:tcPr>
-            <w:tcW w:type="dxa" w:w="4320"/>
-          </w:tcPr>
-          <w:p>
-            <w:r>
-              <w:t>Técnica usada por el psicólogo</w:t>
-            </w:r>
-          </w:p>
-        </w:tc>
-      </w:tr>
-      <w:tr>
-        <w:tc>
-          <w:tcPr>
-            <w:tcW w:type="dxa" w:w="4320"/>
-          </w:tcPr>
-          <w:p>
-            <w:r>
-              <w:t>desarrollo</w:t>
-            </w:r>
-          </w:p>
-        </w:tc>
-        <w:tc>
-          <w:tcPr>
-            <w:tcW w:type="dxa" w:w="4320"/>
-          </w:tcPr>
-          <w:p>
-            <w:r>
-              <w:t>Desarrollo clínico de la sesión</w:t>
-            </w:r>
-          </w:p>
-        </w:tc>
-      </w:tr>
-      <w:tr>
-        <w:tc>
-          <w:tcPr>
-            <w:tcW w:type="dxa" w:w="4320"/>
-          </w:tcPr>
-          <w:p>
-            <w:r>
-              <w:t>objetivo_proxima_sesion</w:t>
-            </w:r>
-          </w:p>
-        </w:tc>
-        <w:tc>
-          <w:tcPr>
-            <w:tcW w:type="dxa" w:w="4320"/>
-          </w:tcPr>
-          <w:p>
-            <w:r>
-              <w:t>Plan o foco siguiente</w:t>
-            </w:r>
-          </w:p>
-        </w:tc>
-      </w:tr>
-      <w:tr>
-        <w:tc>
-          <w:tcPr>
-            <w:tcW w:type="dxa" w:w="4320"/>
-          </w:tcPr>
-          <w:p>
-            <w:r>
-              <w:t>tareas_paciente</w:t>
-            </w:r>
-          </w:p>
-        </w:tc>
-        <w:tc>
-          <w:tcPr>
-            <w:tcW w:type="dxa" w:w="4320"/>
-          </w:tcPr>
-          <w:p>
-            <w:r>
-              <w:t>Actividades o acuerdos para el paciente</w:t>
-            </w:r>
-          </w:p>
-        </w:tc>
-      </w:tr>
-      <w:tr>
-        <w:tc>
-          <w:tcPr>
-            <w:tcW w:type="dxa" w:w="4320"/>
-          </w:tcPr>
-          <w:p>
-            <w:r>
-              <w:t>observaciones_clinicas</w:t>
-            </w:r>
-          </w:p>
-        </w:tc>
-        <w:tc>
-          <w:tcPr>
-            <w:tcW w:type="dxa" w:w="4320"/>
-          </w:tcPr>
-          <w:p>
-            <w:r>
-              <w:t>Notas privadas relevantes</w:t>
-            </w:r>
-          </w:p>
-        </w:tc>
-      </w:tr>
-      <w:tr>
-        <w:tc>
-          <w:tcPr>
-            <w:tcW w:type="dxa" w:w="4320"/>
-          </w:tcPr>
-          <w:p>
-            <w:r>
-              <w:t>riesgo_sesion</w:t>
-            </w:r>
-          </w:p>
-        </w:tc>
-        <w:tc>
-          <w:tcPr>
-            <w:tcW w:type="dxa" w:w="4320"/>
-          </w:tcPr>
-          <w:p>
-            <w:r>
-              <w:t>Nivel de riesgo detectado en esa sesión</w:t>
-            </w:r>
-          </w:p>
-        </w:tc>
-      </w:tr>
-    </w:tbl>
-    <w:p>
-      <w:r>
-        <w:t>Implementación sugerida: mantener notas_sesion para compatibilidad y agregar campos nuevos gradualmente. En frontend, mostrar pestañas o bloques simples.</w:t>
-      </w:r>
-    </w:p>
-    <w:p>
-      <w:r>
-        <w:t>Prioridad: media-alta.</w:t>
+        <w:t>**Estado actual:** cada sesión tiene `notas_sesion` como texto libre.</w:t>
+      </w:r>
+    </w:p>
+    <w:p>
+      <w:r>
+        <w:t>**Hallazgo de la reunión:** Lina mostró que en Medilink existen campos como número de sesión, objetivo, técnica aplicada, desarrollo y objetivo de próxima sesión. Aunque Medilink no le parece amigable, esa estructura sí tiene valor.</w:t>
+      </w:r>
+    </w:p>
+    <w:p>
+      <w:r>
+        <w:t>**Oportunidad:** evolucionar `notas_sesion` hacia secciones clínicas opcionales.</w:t>
+      </w:r>
+    </w:p>
+    <w:p>
+      <w:r>
+        <w:t>Campos sugeridos para `Sesion`:</w:t>
+      </w:r>
+    </w:p>
+    <w:p>
+      <w:r>
+        <w:t>| Campo | Uso |</w:t>
+      </w:r>
+    </w:p>
+    <w:p>
+      <w:r>
+        <w:t>| numero_sesion | Correlativo por paciente |</w:t>
+      </w:r>
+    </w:p>
+    <w:p>
+      <w:r>
+        <w:t>| tema_sesion | Tema u objetivo principal |</w:t>
+      </w:r>
+    </w:p>
+    <w:p>
+      <w:r>
+        <w:t>| tecnica_aplicada | Técnica usada por el psicólogo |</w:t>
+      </w:r>
+    </w:p>
+    <w:p>
+      <w:r>
+        <w:t>| desarrollo | Desarrollo clínico de la sesión |</w:t>
+      </w:r>
+    </w:p>
+    <w:p>
+      <w:r>
+        <w:t>| objetivo_proxima_sesion | Plan o foco siguiente |</w:t>
+      </w:r>
+    </w:p>
+    <w:p>
+      <w:r>
+        <w:t>| tareas_paciente | Actividades o acuerdos para el paciente |</w:t>
+      </w:r>
+    </w:p>
+    <w:p>
+      <w:r>
+        <w:t>| observaciones_clinicas | Notas privadas relevantes |</w:t>
+      </w:r>
+    </w:p>
+    <w:p>
+      <w:r>
+        <w:t>| riesgo_sesion | Nivel de riesgo detectado en esa sesión |</w:t>
+      </w:r>
+    </w:p>
+    <w:p>
+      <w:r>
+        <w:t>**Implementación sugerida:** mantener `notas_sesion` para compatibilidad y agregar campos nuevos gradualmente. En frontend, mostrar pestañas o bloques simples.</w:t>
+      </w:r>
+    </w:p>
+    <w:p>
+      <w:r>
+        <w:t>**Prioridad:** media-alta.</w:t>
       </w:r>
     </w:p>
     <w:p>
@@ -2186,17 +1327,17 @@
     </w:p>
     <w:p>
       <w:r>
-        <w:t>Estado actual: la pantalla de paciente lista sesiones, pero la reunión pide una navegación más clínica y rápida.</w:t>
-      </w:r>
-    </w:p>
-    <w:p>
-      <w:r>
-        <w:t>Hallazgo de la reunión: Lina quiere revisar sesiones como separadores o pestañas, similar a buscar rápidamente en una Biblia. También se habló de hitos y línea de tiempo.</w:t>
-      </w:r>
-    </w:p>
-    <w:p>
-      <w:r>
-        <w:t>Oportunidad: convertir la lista de sesiones en una línea de tiempo clínica.</w:t>
+        <w:t>**Estado actual:** la pantalla de paciente lista sesiones, pero la reunión pide una navegación más clínica y rápida.</w:t>
+      </w:r>
+    </w:p>
+    <w:p>
+      <w:r>
+        <w:t>**Hallazgo de la reunión:** Lina quiere revisar sesiones como separadores o pestañas, similar a buscar rápidamente en una Biblia. También se habló de hitos y línea de tiempo.</w:t>
+      </w:r>
+    </w:p>
+    <w:p>
+      <w:r>
+        <w:t>**Oportunidad:** convertir la lista de sesiones en una línea de tiempo clínica.</w:t>
       </w:r>
     </w:p>
     <w:p>
@@ -2270,12 +1411,12 @@
     </w:p>
     <w:p>
       <w:r>
-        <w:t>Implementación sugerida: primero mejorar las tarjetas actuales con número de sesión y mini resumen. Luego agregar filtros por tipo de evento.</w:t>
-      </w:r>
-    </w:p>
-    <w:p>
-      <w:r>
-        <w:t>Prioridad: media.</w:t>
+        <w:t>**Implementación sugerida:** primero mejorar las tarjetas actuales con número de sesión y mini resumen. Luego agregar filtros por tipo de evento.</w:t>
+      </w:r>
+    </w:p>
+    <w:p>
+      <w:r>
+        <w:t>**Prioridad:** media.</w:t>
       </w:r>
     </w:p>
     <w:p>
@@ -2288,17 +1429,17 @@
     </w:p>
     <w:p>
       <w:r>
-        <w:t>Estado actual: existe chat IA y se guardan mensajes. No existe una entidad clara de informe clínico generado, versionado, descargable y asociado al paciente.</w:t>
-      </w:r>
-    </w:p>
-    <w:p>
-      <w:r>
-        <w:t>Hallazgo de la reunión: se conversó que el informe no debería quedar solo en el chat. Debe poder guardarse, descargarse y reutilizarse como contexto.</w:t>
-      </w:r>
-    </w:p>
-    <w:p>
-      <w:r>
-        <w:t>Oportunidad: crear un módulo InformeIA.</w:t>
+        <w:t>**Estado actual:** existe chat IA y se guardan mensajes. No existe una entidad clara de informe clínico generado, versionado, descargable y asociado al paciente.</w:t>
+      </w:r>
+    </w:p>
+    <w:p>
+      <w:r>
+        <w:t>**Hallazgo de la reunión:** se conversó que el informe no debería quedar solo en el chat. Debe poder guardarse, descargarse y reutilizarse como contexto.</w:t>
+      </w:r>
+    </w:p>
+    <w:p>
+      <w:r>
+        <w:t>**Oportunidad:** crear un módulo `InformeIA`.</w:t>
       </w:r>
     </w:p>
     <w:p>
@@ -2417,12 +1558,12 @@
     </w:p>
     <w:p>
       <w:r>
-        <w:t>Implementación sugerida: crear modelo InformeIA con paciente, psicólogo, tipo, título, contenido, fuentes y fecha. Inicialmente puede generarse desde una respuesta del chat con botón “Guardar como informe”.</w:t>
-      </w:r>
-    </w:p>
-    <w:p>
-      <w:r>
-        <w:t>Prioridad: alta.</w:t>
+        <w:t>**Implementación sugerida:** crear modelo `InformeIA` con paciente, psicólogo, tipo, título, contenido, fuentes y fecha. Inicialmente puede generarse desde una respuesta del chat con botón “Guardar como informe”.</w:t>
+      </w:r>
+    </w:p>
+    <w:p>
+      <w:r>
+        <w:t>**Prioridad:** alta.</w:t>
       </w:r>
     </w:p>
     <w:p>
@@ -2435,17 +1576,17 @@
     </w:p>
     <w:p>
       <w:r>
-        <w:t>Estado actual: el prompt del backend pide responder en español, citar fechas y ser objetivo. Es correcto, pero general.</w:t>
-      </w:r>
-    </w:p>
-    <w:p>
-      <w:r>
-        <w:t>Hallazgo de la reunión: se necesita que la IA responda en bloques útiles para psicólogos, no como chat genérico.</w:t>
-      </w:r>
-    </w:p>
-    <w:p>
-      <w:r>
-        <w:t>Oportunidad: especializar el asistente con una estructura clínica.</w:t>
+        <w:t>**Estado actual:** el prompt del backend pide responder en español, citar fechas y ser objetivo. Es correcto, pero general.</w:t>
+      </w:r>
+    </w:p>
+    <w:p>
+      <w:r>
+        <w:t>**Hallazgo de la reunión:** se necesita que la IA responda en bloques útiles para psicólogos, no como chat genérico.</w:t>
+      </w:r>
+    </w:p>
+    <w:p>
+      <w:r>
+        <w:t>**Oportunidad:** especializar el asistente con una estructura clínica.</w:t>
       </w:r>
     </w:p>
     <w:p>
@@ -2559,7 +1700,12 @@
     </w:p>
     <w:p>
       <w:r>
-        <w:t>... ```</w:t>
+        <w:t>...</w:t>
+      </w:r>
+    </w:p>
+    <w:p>
+      <w:r>
+        <w:t>```</w:t>
       </w:r>
     </w:p>
     <w:p>
@@ -2609,12 +1755,12 @@
     </w:p>
     <w:p>
       <w:r>
-        <w:t>Implementación sugerida: ajustar _consultar_deepseek para incluir un prompt más clínico y estructurado. Más adelante, permitir prompts por tipo de informe.</w:t>
-      </w:r>
-    </w:p>
-    <w:p>
-      <w:r>
-        <w:t>Prioridad: alta.</w:t>
+        <w:t>**Implementación sugerida:** ajustar `_consultar_deepseek` para incluir un prompt más clínico y estructurado. Más adelante, permitir prompts por tipo de informe.</w:t>
+      </w:r>
+    </w:p>
+    <w:p>
+      <w:r>
+        <w:t>**Prioridad:** alta.</w:t>
       </w:r>
     </w:p>
     <w:p>
@@ -2627,17 +1773,17 @@
     </w:p>
     <w:p>
       <w:r>
-        <w:t>Estado actual: el asistente solo usa contexto de segmentos de sesiones. No se observó base documental DSM-5.</w:t>
-      </w:r>
-    </w:p>
-    <w:p>
-      <w:r>
-        <w:t>Hallazgo de la reunión: Lina y Paulo mencionaron que el DSM-5 sería una base clave para orientar diagnósticos psicológicos de forma profesional.</w:t>
-      </w:r>
-    </w:p>
-    <w:p>
-      <w:r>
-        <w:t>Oportunidad: usar DSM-5 como referencia para hipótesis diagnósticas, no como diagnóstico automático.</w:t>
+        <w:t>**Estado actual:** el asistente solo usa contexto de segmentos de sesiones. No se observó base documental DSM-5.</w:t>
+      </w:r>
+    </w:p>
+    <w:p>
+      <w:r>
+        <w:t>**Hallazgo de la reunión:** Lina y Paulo mencionaron que el DSM-5 sería una base clave para orientar diagnósticos psicológicos de forma profesional.</w:t>
+      </w:r>
+    </w:p>
+    <w:p>
+      <w:r>
+        <w:t>**Oportunidad:** usar DSM-5 como referencia para hipótesis diagnósticas, no como diagnóstico automático.</w:t>
       </w:r>
     </w:p>
     <w:p>
@@ -2687,12 +1833,12 @@
     </w:p>
     <w:p>
       <w:r>
-        <w:t>Implementación sugerida: primero agregar selector manual de diagnóstico o campo de diagnóstico sospechado. Luego implementar RAG con documento DSM-5 si hay permiso de uso.</w:t>
-      </w:r>
-    </w:p>
-    <w:p>
-      <w:r>
-        <w:t>Prioridad: media por valor alto, pero con cuidado legal y clínico.</w:t>
+        <w:t>**Implementación sugerida:** primero agregar selector manual de diagnóstico o campo de diagnóstico sospechado. Luego implementar RAG con documento DSM-5 si hay permiso de uso.</w:t>
+      </w:r>
+    </w:p>
+    <w:p>
+      <w:r>
+        <w:t>**Prioridad:** media por valor alto, pero con cuidado legal y clínico.</w:t>
       </w:r>
     </w:p>
     <w:p>
@@ -2705,17 +1851,17 @@
     </w:p>
     <w:p>
       <w:r>
-        <w:t>Estado actual: no existe módulo de tests.</w:t>
-      </w:r>
-    </w:p>
-    <w:p>
-      <w:r>
-        <w:t>Hallazgo de la reunión: este fue el hallazgo más potente. Lina mostró tests que hoy resuelve con Google Forms, Excel, fórmulas, puntajes manuales y archivos sueltos.</w:t>
-      </w:r>
-    </w:p>
-    <w:p>
-      <w:r>
-        <w:t>Oportunidad: digitalizar tests y convertirlos en un producto diferencial de la app.</w:t>
+        <w:t>**Estado actual:** no existe módulo de tests.</w:t>
+      </w:r>
+    </w:p>
+    <w:p>
+      <w:r>
+        <w:t>**Hallazgo de la reunión:** este fue el hallazgo más potente. Lina mostró tests que hoy resuelve con Google Forms, Excel, fórmulas, puntajes manuales y archivos sueltos.</w:t>
+      </w:r>
+    </w:p>
+    <w:p>
+      <w:r>
+        <w:t>**Oportunidad:** digitalizar tests y convertirlos en un producto diferencial de la app.</w:t>
       </w:r>
     </w:p>
     <w:p>
@@ -2816,229 +1962,59 @@
         <w:t>Tests mencionados:</w:t>
       </w:r>
     </w:p>
-    <w:tbl>
-      <w:tblPr>
-        <w:tblStyle w:val="TableGrid"/>
-        <w:tblW w:type="auto" w:w="0"/>
-        <w:tblLook w:firstColumn="1" w:firstRow="1" w:lastColumn="0" w:lastRow="0" w:noHBand="0" w:noVBand="1" w:val="04A0"/>
-      </w:tblPr>
-      <w:tblGrid>
-        <w:gridCol w:w="4320"/>
-        <w:gridCol w:w="4320"/>
-      </w:tblGrid>
-      <w:tr>
-        <w:tc>
-          <w:tcPr>
-            <w:tcW w:type="dxa" w:w="4320"/>
-          </w:tcPr>
-          <w:p>
-            <w:r>
-              <w:rPr>
-                <w:b/>
-              </w:rPr>
-              <w:t>Test</w:t>
-            </w:r>
-          </w:p>
-        </w:tc>
-        <w:tc>
-          <w:tcPr>
-            <w:tcW w:type="dxa" w:w="4320"/>
-          </w:tcPr>
-          <w:p>
-            <w:r>
-              <w:rPr>
-                <w:b/>
-              </w:rPr>
-              <w:t>Oportunidad</w:t>
-            </w:r>
-          </w:p>
-        </w:tc>
-      </w:tr>
-      <w:tr>
-        <w:tc>
-          <w:tcPr>
-            <w:tcW w:type="dxa" w:w="4320"/>
-          </w:tcPr>
-          <w:p>
-            <w:r>
-              <w:t>Creencias de Albert Ellis</w:t>
-            </w:r>
-          </w:p>
-        </w:tc>
-        <w:tc>
-          <w:tcPr>
-            <w:tcW w:type="dxa" w:w="4320"/>
-          </w:tcPr>
-          <w:p>
-            <w:r>
-              <w:t>Primer candidato por reglas matemáticas claras</w:t>
-            </w:r>
-          </w:p>
-        </w:tc>
-      </w:tr>
-      <w:tr>
-        <w:tc>
-          <w:tcPr>
-            <w:tcW w:type="dxa" w:w="4320"/>
-          </w:tcPr>
-          <w:p>
-            <w:r>
-              <w:t>Rueda de la vida</w:t>
-            </w:r>
-          </w:p>
-        </w:tc>
-        <w:tc>
-          <w:tcPr>
-            <w:tcW w:type="dxa" w:w="4320"/>
-          </w:tcPr>
-          <w:p>
-            <w:r>
-              <w:t>Resultado gráfico útil para paciente y psicólogo</w:t>
-            </w:r>
-          </w:p>
-        </w:tc>
-      </w:tr>
-      <w:tr>
-        <w:tc>
-          <w:tcPr>
-            <w:tcW w:type="dxa" w:w="4320"/>
-          </w:tcPr>
-          <w:p>
-            <w:r>
-              <w:t>Heridas de infancia / máscaras</w:t>
-            </w:r>
-          </w:p>
-        </w:tc>
-        <w:tc>
-          <w:tcPr>
-            <w:tcW w:type="dxa" w:w="4320"/>
-          </w:tcPr>
-          <w:p>
-            <w:r>
-              <w:t>Útil para ficha terapéutica y objetivos</w:t>
-            </w:r>
-          </w:p>
-        </w:tc>
-      </w:tr>
-      <w:tr>
-        <w:tc>
-          <w:tcPr>
-            <w:tcW w:type="dxa" w:w="4320"/>
-          </w:tcPr>
-          <w:p>
-            <w:r>
-              <w:t>Test de valores</w:t>
-            </w:r>
-          </w:p>
-        </w:tc>
-        <w:tc>
-          <w:tcPr>
-            <w:tcW w:type="dxa" w:w="4320"/>
-          </w:tcPr>
-          <w:p>
-            <w:r>
-              <w:t>Conecta con áreas de intervención de Lina</w:t>
-            </w:r>
-          </w:p>
-        </w:tc>
-      </w:tr>
-      <w:tr>
-        <w:tc>
-          <w:tcPr>
-            <w:tcW w:type="dxa" w:w="4320"/>
-          </w:tcPr>
-          <w:p>
-            <w:r>
-              <w:t>Depression Inventory</w:t>
-            </w:r>
-          </w:p>
-        </w:tc>
-        <w:tc>
-          <w:tcPr>
-            <w:tcW w:type="dxa" w:w="4320"/>
-          </w:tcPr>
-          <w:p>
-            <w:r>
-              <w:t>Potencial futuro, revisar licencia y validación</w:t>
-            </w:r>
-          </w:p>
-        </w:tc>
-      </w:tr>
-      <w:tr>
-        <w:tc>
-          <w:tcPr>
-            <w:tcW w:type="dxa" w:w="4320"/>
-          </w:tcPr>
-          <w:p>
-            <w:r>
-              <w:t>16PF</w:t>
-            </w:r>
-          </w:p>
-        </w:tc>
-        <w:tc>
-          <w:tcPr>
-            <w:tcW w:type="dxa" w:w="4320"/>
-          </w:tcPr>
-          <w:p>
-            <w:r>
-              <w:t>Potencial alto, requiere temporizador y reglas estrictas</w:t>
-            </w:r>
-          </w:p>
-        </w:tc>
-      </w:tr>
-      <w:tr>
-        <w:tc>
-          <w:tcPr>
-            <w:tcW w:type="dxa" w:w="4320"/>
-          </w:tcPr>
-          <w:p>
-            <w:r>
-              <w:t>ADOS/A2</w:t>
-            </w:r>
-          </w:p>
-        </w:tc>
-        <w:tc>
-          <w:tcPr>
-            <w:tcW w:type="dxa" w:w="4320"/>
-          </w:tcPr>
-          <w:p>
-            <w:r>
-              <w:t>Alto valor, pero requiere certificación y cuidado legal</w:t>
-            </w:r>
-          </w:p>
-        </w:tc>
-      </w:tr>
-      <w:tr>
-        <w:tc>
-          <w:tcPr>
-            <w:tcW w:type="dxa" w:w="4320"/>
-          </w:tcPr>
-          <w:p>
-            <w:r>
-              <w:t>Rorschach y proyectivos</w:t>
-            </w:r>
-          </w:p>
-        </w:tc>
-        <w:tc>
-          <w:tcPr>
-            <w:tcW w:type="dxa" w:w="4320"/>
-          </w:tcPr>
-          <w:p>
-            <w:r>
-              <w:t>Futuro; más complejo por interpretación no matemática</w:t>
-            </w:r>
-          </w:p>
-        </w:tc>
-      </w:tr>
-    </w:tbl>
-    <w:p>
-      <w:r>
-        <w:t>Principio clave: la corrección matemática debe hacerla el sistema, no la IA. La IA puede ayudar a redactar interpretación o sugerencias para el psicólogo.</w:t>
-      </w:r>
-    </w:p>
-    <w:p>
-      <w:r>
-        <w:t>Prioridad: muy alta por diferencial comercial.</w:t>
+    <w:p>
+      <w:r>
+        <w:t>| Test | Oportunidad |</w:t>
+      </w:r>
+    </w:p>
+    <w:p>
+      <w:r>
+        <w:t>| Creencias de Albert Ellis | Primer candidato por reglas matemáticas claras |</w:t>
+      </w:r>
+    </w:p>
+    <w:p>
+      <w:r>
+        <w:t>| Rueda de la vida | Resultado gráfico útil para paciente y psicólogo |</w:t>
+      </w:r>
+    </w:p>
+    <w:p>
+      <w:r>
+        <w:t>| Heridas de infancia / máscaras | Útil para ficha terapéutica y objetivos |</w:t>
+      </w:r>
+    </w:p>
+    <w:p>
+      <w:r>
+        <w:t>| Test de valores | Conecta con áreas de intervención de Lina |</w:t>
+      </w:r>
+    </w:p>
+    <w:p>
+      <w:r>
+        <w:t>| Depression Inventory | Potencial futuro, revisar licencia y validación |</w:t>
+      </w:r>
+    </w:p>
+    <w:p>
+      <w:r>
+        <w:t>| 16PF | Potencial alto, requiere temporizador y reglas estrictas |</w:t>
+      </w:r>
+    </w:p>
+    <w:p>
+      <w:r>
+        <w:t>| ADOS/A2 | Alto valor, pero requiere certificación y cuidado legal |</w:t>
+      </w:r>
+    </w:p>
+    <w:p>
+      <w:r>
+        <w:t>| Rorschach y proyectivos | Futuro; más complejo por interpretación no matemática |</w:t>
+      </w:r>
+    </w:p>
+    <w:p>
+      <w:r>
+        <w:t>**Principio clave:** la corrección matemática debe hacerla el sistema, no la IA. La IA puede ayudar a redactar interpretación o sugerencias para el psicólogo.</w:t>
+      </w:r>
+    </w:p>
+    <w:p>
+      <w:r>
+        <w:t>**Prioridad:** muy alta por diferencial comercial.</w:t>
       </w:r>
     </w:p>
     <w:p>
@@ -3051,17 +2027,17 @@
     </w:p>
     <w:p>
       <w:r>
-        <w:t>Estado actual: el paciente no entra a la app. Esto es correcto para el panel clínico, pero falta un flujo para que responda tests.</w:t>
-      </w:r>
-    </w:p>
-    <w:p>
-      <w:r>
-        <w:t>Hallazgo de la reunión: Lina envía links de Google Forms. La idea es reemplazar eso por links propios de la plataforma.</w:t>
-      </w:r>
-    </w:p>
-    <w:p>
-      <w:r>
-        <w:t>Oportunidad: crear links públicos seguros para responder tests sin acceder al panel del psicólogo.</w:t>
+        <w:t>**Estado actual:** el paciente no entra a la app. Esto es correcto para el panel clínico, pero falta un flujo para que responda tests.</w:t>
+      </w:r>
+    </w:p>
+    <w:p>
+      <w:r>
+        <w:t>**Hallazgo de la reunión:** Lina envía links de Google Forms. La idea es reemplazar eso por links propios de la plataforma.</w:t>
+      </w:r>
+    </w:p>
+    <w:p>
+      <w:r>
+        <w:t>**Oportunidad:** crear links públicos seguros para responder tests sin acceder al panel del psicólogo.</w:t>
       </w:r>
     </w:p>
     <w:p>
@@ -3127,7 +2103,7 @@
     </w:p>
     <w:p>
       <w:r>
-        <w:t>Prioridad: alta si se implementa el módulo de tests.</w:t>
+        <w:t>**Prioridad:** alta si se implementa el módulo de tests.</w:t>
       </w:r>
     </w:p>
     <w:p>
@@ -3140,17 +2116,17 @@
     </w:p>
     <w:p>
       <w:r>
-        <w:t>Estado actual: no se observan listas personalizadas por psicólogo.</w:t>
-      </w:r>
-    </w:p>
-    <w:p>
-      <w:r>
-        <w:t>Hallazgo de la reunión: Lina, Benjamín y Paulo coincidieron en que cada psicólogo tiene categorías distintas. No conviene que nosotros intentemos definir todo.</w:t>
-      </w:r>
-    </w:p>
-    <w:p>
-      <w:r>
-        <w:t>Oportunidad: permitir que cada psicólogo cree listas simples.</w:t>
+        <w:t>**Estado actual:** no se observan listas personalizadas por psicólogo.</w:t>
+      </w:r>
+    </w:p>
+    <w:p>
+      <w:r>
+        <w:t>**Hallazgo de la reunión:** Lina, Benjamín y Paulo coincidieron en que cada psicólogo tiene categorías distintas. No conviene que nosotros intentemos definir todo.</w:t>
+      </w:r>
+    </w:p>
+    <w:p>
+      <w:r>
+        <w:t>**Oportunidad:** permitir que cada psicólogo cree listas simples.</w:t>
       </w:r>
     </w:p>
     <w:p>
@@ -3232,12 +2208,12 @@
     </w:p>
     <w:p>
       <w:r>
-        <w:t>Implementación sugerida: crear CategoriaPersonalizada y OpcionPersonalizada. En interfaz, permitir agregar una opción nueva desde el mismo formulario sin salir de la sesión.</w:t>
-      </w:r>
-    </w:p>
-    <w:p>
-      <w:r>
-        <w:t>Prioridad: media.</w:t>
+        <w:t>**Implementación sugerida:** crear `CategoriaPersonalizada` y `OpcionPersonalizada`. En interfaz, permitir agregar una opción nueva desde el mismo formulario sin salir de la sesión.</w:t>
+      </w:r>
+    </w:p>
+    <w:p>
+      <w:r>
+        <w:t>**Prioridad:** media.</w:t>
       </w:r>
     </w:p>
     <w:p>
@@ -3250,17 +2226,17 @@
     </w:p>
     <w:p>
       <w:r>
-        <w:t>Estado actual: las sesiones tienen fecha/hora, pero no hay una agenda completa.</w:t>
-      </w:r>
-    </w:p>
-    <w:p>
-      <w:r>
-        <w:t>Hallazgo de la reunión: Lina usa su planilla como calendario semanal. También comparó con plataformas que recuerdan pacientes.</w:t>
-      </w:r>
-    </w:p>
-    <w:p>
-      <w:r>
-        <w:t>Oportunidad: convertir sesiones programadas en una agenda real.</w:t>
+        <w:t>**Estado actual:** las sesiones tienen fecha/hora, pero no hay una agenda completa.</w:t>
+      </w:r>
+    </w:p>
+    <w:p>
+      <w:r>
+        <w:t>**Hallazgo de la reunión:** Lina usa su planilla como calendario semanal. También comparó con plataformas que recuerdan pacientes.</w:t>
+      </w:r>
+    </w:p>
+    <w:p>
+      <w:r>
+        <w:t>**Oportunidad:** convertir sesiones programadas en una agenda real.</w:t>
       </w:r>
     </w:p>
     <w:p>
@@ -3326,12 +2302,12 @@
     </w:p>
     <w:p>
       <w:r>
-        <w:t>Implementación sugerida: partir reutilizando Sesion con estado pendiente y fecha futura. Más adelante separar Cita si se necesita.</w:t>
-      </w:r>
-    </w:p>
-    <w:p>
-      <w:r>
-        <w:t>Prioridad: media-alta.</w:t>
+        <w:t>**Implementación sugerida:** partir reutilizando `Sesion` con estado pendiente y fecha futura. Más adelante separar `Cita` si se necesita.</w:t>
+      </w:r>
+    </w:p>
+    <w:p>
+      <w:r>
+        <w:t>**Prioridad:** media-alta.</w:t>
       </w:r>
     </w:p>
     <w:p>
@@ -3344,17 +2320,17 @@
     </w:p>
     <w:p>
       <w:r>
-        <w:t>Estado actual: no se observó módulo de pagos.</w:t>
-      </w:r>
-    </w:p>
-    <w:p>
-      <w:r>
-        <w:t>Hallazgo de la reunión: Lina registra pagos y boletas manualmente. Encuadrado es atractivo porque automatiza agenda, recordatorios y boletas.</w:t>
-      </w:r>
-    </w:p>
-    <w:p>
-      <w:r>
-        <w:t>Oportunidad: agregar un módulo administrativo básico para no perder contra herramientas como Encuadrado.</w:t>
+        <w:t>**Estado actual:** no se observó módulo de pagos.</w:t>
+      </w:r>
+    </w:p>
+    <w:p>
+      <w:r>
+        <w:t>**Hallazgo de la reunión:** Lina registra pagos y boletas manualmente. Encuadrado es atractivo porque automatiza agenda, recordatorios y boletas.</w:t>
+      </w:r>
+    </w:p>
+    <w:p>
+      <w:r>
+        <w:t>**Oportunidad:** agregar un módulo administrativo básico para no perder contra herramientas como Encuadrado.</w:t>
       </w:r>
     </w:p>
     <w:p>
@@ -3457,7 +2433,7 @@
     </w:p>
     <w:p>
       <w:r>
-        <w:t>Prioridad: media. No es el diferencial clínico principal, pero sí pesa comercialmente.</w:t>
+        <w:t>**Prioridad:** media. No es el diferencial clínico principal, pero sí pesa comercialmente.</w:t>
       </w:r>
     </w:p>
     <w:p>
@@ -3470,17 +2446,17 @@
     </w:p>
     <w:p>
       <w:r>
-        <w:t>Estado actual: no hay dashboard de métricas clínicas/comerciales.</w:t>
-      </w:r>
-    </w:p>
-    <w:p>
-      <w:r>
-        <w:t>Hallazgo de la reunión: Lina registra origen del paciente para saber de dónde vienen sus consultas. Benjamín lo vio como punto de venta.</w:t>
-      </w:r>
-    </w:p>
-    <w:p>
-      <w:r>
-        <w:t>Oportunidad: dar al psicólogo estadísticas simples.</w:t>
+        <w:t>**Estado actual:** no hay dashboard de métricas clínicas/comerciales.</w:t>
+      </w:r>
+    </w:p>
+    <w:p>
+      <w:r>
+        <w:t>**Hallazgo de la reunión:** Lina registra origen del paciente para saber de dónde vienen sus consultas. Benjamín lo vio como punto de venta.</w:t>
+      </w:r>
+    </w:p>
+    <w:p>
+      <w:r>
+        <w:t>**Oportunidad:** dar al psicólogo estadísticas simples.</w:t>
       </w:r>
     </w:p>
     <w:p>
@@ -3570,7 +2546,7 @@
     </w:p>
     <w:p>
       <w:r>
-        <w:t>Prioridad: media.</w:t>
+        <w:t>**Prioridad:** media.</w:t>
       </w:r>
     </w:p>
     <w:p>
@@ -3583,17 +2559,17 @@
     </w:p>
     <w:p>
       <w:r>
-        <w:t>Estado actual: la app soporta sesión virtual con Meet/Zoom vía extensión y captions.</w:t>
-      </w:r>
-    </w:p>
-    <w:p>
-      <w:r>
-        <w:t>Hallazgo de la reunión: Paulo propuso una videollamada dentro de la plataforma, con link propio al paciente.</w:t>
-      </w:r>
-    </w:p>
-    <w:p>
-      <w:r>
-        <w:t>Oportunidad: visión futura para no depender de Meet/Zoom/Teams.</w:t>
+        <w:t>**Estado actual:** la app soporta sesión virtual con Meet/Zoom vía extensión y captions.</w:t>
+      </w:r>
+    </w:p>
+    <w:p>
+      <w:r>
+        <w:t>**Hallazgo de la reunión:** Paulo propuso una videollamada dentro de la plataforma, con link propio al paciente.</w:t>
+      </w:r>
+    </w:p>
+    <w:p>
+      <w:r>
+        <w:t>**Oportunidad:** visión futura para no depender de Meet/Zoom/Teams.</w:t>
       </w:r>
     </w:p>
     <w:p>
@@ -3643,7 +2619,7 @@
     </w:p>
     <w:p>
       <w:r>
-        <w:t>Prioridad: baja para MVP. Alta para visión futura.</w:t>
+        <w:t>**Prioridad:** baja para MVP. Alta para visión futura.</w:t>
       </w:r>
     </w:p>
     <w:p>
@@ -3674,7 +2650,7 @@
     </w:p>
     <w:p>
       <w:r>
-        <w:t>Una plataforma hecha específicamente para psicólogos: ficha clínica, sesiones, transcripción, IA, tests, informes, agenda y pagos en un solo lugar.</w:t>
+        <w:t>**Una plataforma hecha específicamente para psicólogos: ficha clínica, sesiones, transcripción, IA, tests, informes, agenda y pagos en un solo lugar.**</w:t>
       </w:r>
     </w:p>
     <w:p>
@@ -3877,283 +2853,46 @@
         <w:t>Estas tareas tienen alto impacto y conectan directamente con la reunión.</w:t>
       </w:r>
     </w:p>
-    <w:tbl>
-      <w:tblPr>
-        <w:tblStyle w:val="TableGrid"/>
-        <w:tblW w:type="auto" w:w="0"/>
-        <w:tblLook w:firstColumn="1" w:firstRow="1" w:lastColumn="0" w:lastRow="0" w:noHBand="0" w:noVBand="1" w:val="04A0"/>
-      </w:tblPr>
-      <w:tblGrid>
-        <w:gridCol w:w="2880"/>
-        <w:gridCol w:w="2880"/>
-        <w:gridCol w:w="2880"/>
-      </w:tblGrid>
-      <w:tr>
-        <w:tc>
-          <w:tcPr>
-            <w:tcW w:type="dxa" w:w="2880"/>
-          </w:tcPr>
-          <w:p>
-            <w:r>
-              <w:rPr>
-                <w:b/>
-              </w:rPr>
-              <w:t>Prioridad</w:t>
-            </w:r>
-          </w:p>
-        </w:tc>
-        <w:tc>
-          <w:tcPr>
-            <w:tcW w:type="dxa" w:w="2880"/>
-          </w:tcPr>
-          <w:p>
-            <w:r>
-              <w:rPr>
-                <w:b/>
-              </w:rPr>
-              <w:t>Oportunidad</w:t>
-            </w:r>
-          </w:p>
-        </w:tc>
-        <w:tc>
-          <w:tcPr>
-            <w:tcW w:type="dxa" w:w="2880"/>
-          </w:tcPr>
-          <w:p>
-            <w:r>
-              <w:rPr>
-                <w:b/>
-              </w:rPr>
-              <w:t>Por qué ahora</w:t>
-            </w:r>
-          </w:p>
-        </w:tc>
-      </w:tr>
-      <w:tr>
-        <w:tc>
-          <w:tcPr>
-            <w:tcW w:type="dxa" w:w="2880"/>
-          </w:tcPr>
-          <w:p>
-            <w:r>
-              <w:t>1</w:t>
-            </w:r>
-          </w:p>
-        </w:tc>
-        <w:tc>
-          <w:tcPr>
-            <w:tcW w:type="dxa" w:w="2880"/>
-          </w:tcPr>
-          <w:p>
-            <w:r>
-              <w:t>Número correlativo de sesión</w:t>
-            </w:r>
-          </w:p>
-        </w:tc>
-        <w:tc>
-          <w:tcPr>
-            <w:tcW w:type="dxa" w:w="2880"/>
-          </w:tcPr>
-          <w:p>
-            <w:r>
-              <w:t>Dolor explícito, bajo esfuerzo, mejora inmediata</w:t>
-            </w:r>
-          </w:p>
-        </w:tc>
-      </w:tr>
-      <w:tr>
-        <w:tc>
-          <w:tcPr>
-            <w:tcW w:type="dxa" w:w="2880"/>
-          </w:tcPr>
-          <w:p>
-            <w:r>
-              <w:t>2</w:t>
-            </w:r>
-          </w:p>
-        </w:tc>
-        <w:tc>
-          <w:tcPr>
-            <w:tcW w:type="dxa" w:w="2880"/>
-          </w:tcPr>
-          <w:p>
-            <w:r>
-              <w:t>Ficha clínica ampliada</w:t>
-            </w:r>
-          </w:p>
-        </w:tc>
-        <w:tc>
-          <w:tcPr>
-            <w:tcW w:type="dxa" w:w="2880"/>
-          </w:tcPr>
-          <w:p>
-            <w:r>
-              <w:t>La ficha actual quedó corta frente al uso real</w:t>
-            </w:r>
-          </w:p>
-        </w:tc>
-      </w:tr>
-      <w:tr>
-        <w:tc>
-          <w:tcPr>
-            <w:tcW w:type="dxa" w:w="2880"/>
-          </w:tcPr>
-          <w:p>
-            <w:r>
-              <w:t>3</w:t>
-            </w:r>
-          </w:p>
-        </w:tc>
-        <w:tc>
-          <w:tcPr>
-            <w:tcW w:type="dxa" w:w="2880"/>
-          </w:tcPr>
-          <w:p>
-            <w:r>
-              <w:t>Objetivos de intervención</w:t>
-            </w:r>
-          </w:p>
-        </w:tc>
-        <w:tc>
-          <w:tcPr>
-            <w:tcW w:type="dxa" w:w="2880"/>
-          </w:tcPr>
-          <w:p>
-            <w:r>
-              <w:t>Permite IA mucho más útil por paciente</w:t>
-            </w:r>
-          </w:p>
-        </w:tc>
-      </w:tr>
-      <w:tr>
-        <w:tc>
-          <w:tcPr>
-            <w:tcW w:type="dxa" w:w="2880"/>
-          </w:tcPr>
-          <w:p>
-            <w:r>
-              <w:t>4</w:t>
-            </w:r>
-          </w:p>
-        </w:tc>
-        <w:tc>
-          <w:tcPr>
-            <w:tcW w:type="dxa" w:w="2880"/>
-          </w:tcPr>
-          <w:p>
-            <w:r>
-              <w:t>Prompt IA estructurado</w:t>
-            </w:r>
-          </w:p>
-        </w:tc>
-        <w:tc>
-          <w:tcPr>
-            <w:tcW w:type="dxa" w:w="2880"/>
-          </w:tcPr>
-          <w:p>
-            <w:r>
-              <w:t>Mejora el valor del chat existente sin gran cambio técnico</w:t>
-            </w:r>
-          </w:p>
-        </w:tc>
-      </w:tr>
-      <w:tr>
-        <w:tc>
-          <w:tcPr>
-            <w:tcW w:type="dxa" w:w="2880"/>
-          </w:tcPr>
-          <w:p>
-            <w:r>
-              <w:t>5</w:t>
-            </w:r>
-          </w:p>
-        </w:tc>
-        <w:tc>
-          <w:tcPr>
-            <w:tcW w:type="dxa" w:w="2880"/>
-          </w:tcPr>
-          <w:p>
-            <w:r>
-              <w:t>Guardar respuesta IA como informe</w:t>
-            </w:r>
-          </w:p>
-        </w:tc>
-        <w:tc>
-          <w:tcPr>
-            <w:tcW w:type="dxa" w:w="2880"/>
-          </w:tcPr>
-          <w:p>
-            <w:r>
-              <w:t>Convierte chat en documento clínico útil</w:t>
-            </w:r>
-          </w:p>
-        </w:tc>
-      </w:tr>
-      <w:tr>
-        <w:tc>
-          <w:tcPr>
-            <w:tcW w:type="dxa" w:w="2880"/>
-          </w:tcPr>
-          <w:p>
-            <w:r>
-              <w:t>6</w:t>
-            </w:r>
-          </w:p>
-        </w:tc>
-        <w:tc>
-          <w:tcPr>
-            <w:tcW w:type="dxa" w:w="2880"/>
-          </w:tcPr>
-          <w:p>
-            <w:r>
-              <w:t>Consentimiento informado básico</w:t>
-            </w:r>
-          </w:p>
-        </w:tc>
-        <w:tc>
-          <w:tcPr>
-            <w:tcW w:type="dxa" w:w="2880"/>
-          </w:tcPr>
-          <w:p>
-            <w:r>
-              <w:t>Reduce riesgo por grabación/transcripción</w:t>
-            </w:r>
-          </w:p>
-        </w:tc>
-      </w:tr>
-      <w:tr>
-        <w:tc>
-          <w:tcPr>
-            <w:tcW w:type="dxa" w:w="2880"/>
-          </w:tcPr>
-          <w:p>
-            <w:r>
-              <w:t>7</w:t>
-            </w:r>
-          </w:p>
-        </w:tc>
-        <w:tc>
-          <w:tcPr>
-            <w:tcW w:type="dxa" w:w="2880"/>
-          </w:tcPr>
-          <w:p>
-            <w:r>
-              <w:t>Primer test digitalizado</w:t>
-            </w:r>
-          </w:p>
-        </w:tc>
-        <w:tc>
-          <w:tcPr>
-            <w:tcW w:type="dxa" w:w="2880"/>
-          </w:tcPr>
-          <w:p>
-            <w:r>
-              <w:t>Diferencial comercial más fuerte detectado</w:t>
-            </w:r>
-          </w:p>
-        </w:tc>
-      </w:tr>
-    </w:tbl>
+    <w:p>
+      <w:r>
+        <w:t>| Prioridad | Oportunidad | Por qué ahora |</w:t>
+      </w:r>
+    </w:p>
+    <w:p>
+      <w:r>
+        <w:t>| 1 | Número correlativo de sesión | Dolor explícito, bajo esfuerzo, mejora inmediata |</w:t>
+      </w:r>
+    </w:p>
+    <w:p>
+      <w:r>
+        <w:t>| 2 | Ficha clínica ampliada | La ficha actual quedó corta frente al uso real |</w:t>
+      </w:r>
+    </w:p>
+    <w:p>
+      <w:r>
+        <w:t>| 3 | Objetivos de intervención | Permite IA mucho más útil por paciente |</w:t>
+      </w:r>
+    </w:p>
+    <w:p>
+      <w:r>
+        <w:t>| 4 | Prompt IA estructurado | Mejora el valor del chat existente sin gran cambio técnico |</w:t>
+      </w:r>
+    </w:p>
+    <w:p>
+      <w:r>
+        <w:t>| 5 | Guardar respuesta IA como informe | Convierte chat en documento clínico útil |</w:t>
+      </w:r>
+    </w:p>
+    <w:p>
+      <w:r>
+        <w:t>| 6 | Consentimiento informado básico | Reduce riesgo por grabación/transcripción |</w:t>
+      </w:r>
+    </w:p>
+    <w:p>
+      <w:r>
+        <w:t>| 7 | Primer test digitalizado | Diferencial comercial más fuerte detectado |</w:t>
+      </w:r>
+    </w:p>
     <w:p>
       <w:pPr>
         <w:pStyle w:val="Heading3"/>
@@ -4164,370 +2903,49 @@
     </w:p>
     <w:p>
       <w:r>
-        <w:t>Actualización posterior a la primera iteración de desarrollo: se implementaron los primeros cinco puntos priorizados. Consentimiento informado y primer test digitalizado quedan pendientes por decisión de producto para una etapa posterior.</w:t>
-      </w:r>
-    </w:p>
-    <w:tbl>
-      <w:tblPr>
-        <w:tblStyle w:val="TableGrid"/>
-        <w:tblW w:type="auto" w:w="0"/>
-        <w:tblLook w:firstColumn="1" w:firstRow="1" w:lastColumn="0" w:lastRow="0" w:noHBand="0" w:noVBand="1" w:val="04A0"/>
-      </w:tblPr>
-      <w:tblGrid>
-        <w:gridCol w:w="2160"/>
-        <w:gridCol w:w="2160"/>
-        <w:gridCol w:w="2160"/>
-        <w:gridCol w:w="2160"/>
-      </w:tblGrid>
-      <w:tr>
-        <w:tc>
-          <w:tcPr>
-            <w:tcW w:type="dxa" w:w="2160"/>
-          </w:tcPr>
-          <w:p>
-            <w:r>
-              <w:rPr>
-                <w:b/>
-              </w:rPr>
-              <w:t>Prioridad</w:t>
-            </w:r>
-          </w:p>
-        </w:tc>
-        <w:tc>
-          <w:tcPr>
-            <w:tcW w:type="dxa" w:w="2160"/>
-          </w:tcPr>
-          <w:p>
-            <w:r>
-              <w:rPr>
-                <w:b/>
-              </w:rPr>
-              <w:t>Oportunidad</w:t>
-            </w:r>
-          </w:p>
-        </w:tc>
-        <w:tc>
-          <w:tcPr>
-            <w:tcW w:type="dxa" w:w="2160"/>
-          </w:tcPr>
-          <w:p>
-            <w:r>
-              <w:rPr>
-                <w:b/>
-              </w:rPr>
-              <w:t>Estado</w:t>
-            </w:r>
-          </w:p>
-        </w:tc>
-        <w:tc>
-          <w:tcPr>
-            <w:tcW w:type="dxa" w:w="2160"/>
-          </w:tcPr>
-          <w:p>
-            <w:r>
-              <w:rPr>
-                <w:b/>
-              </w:rPr>
-              <w:t>Implementación realizada</w:t>
-            </w:r>
-          </w:p>
-        </w:tc>
-      </w:tr>
-      <w:tr>
-        <w:tc>
-          <w:tcPr>
-            <w:tcW w:type="dxa" w:w="2160"/>
-          </w:tcPr>
-          <w:p>
-            <w:r>
-              <w:t>1</w:t>
-            </w:r>
-          </w:p>
-        </w:tc>
-        <w:tc>
-          <w:tcPr>
-            <w:tcW w:type="dxa" w:w="2160"/>
-          </w:tcPr>
-          <w:p>
-            <w:r>
-              <w:t>Número correlativo de sesión</w:t>
-            </w:r>
-          </w:p>
-        </w:tc>
-        <w:tc>
-          <w:tcPr>
-            <w:tcW w:type="dxa" w:w="2160"/>
-          </w:tcPr>
-          <w:p>
-            <w:r>
-              <w:t>Implementado</w:t>
-            </w:r>
-          </w:p>
-        </w:tc>
-        <w:tc>
-          <w:tcPr>
-            <w:tcW w:type="dxa" w:w="2160"/>
-          </w:tcPr>
-          <w:p>
-            <w:r>
-              <w:t>Se agregó numero_sesion a Sesion, con backfill de sesiones existentes y asignación automática para sesiones presenciales/remotas. Se muestra en lista, detalle y PDF.</w:t>
-            </w:r>
-          </w:p>
-        </w:tc>
-      </w:tr>
-      <w:tr>
-        <w:tc>
-          <w:tcPr>
-            <w:tcW w:type="dxa" w:w="2160"/>
-          </w:tcPr>
-          <w:p>
-            <w:r>
-              <w:t>2</w:t>
-            </w:r>
-          </w:p>
-        </w:tc>
-        <w:tc>
-          <w:tcPr>
-            <w:tcW w:type="dxa" w:w="2160"/>
-          </w:tcPr>
-          <w:p>
-            <w:r>
-              <w:t>Ficha clínica ampliada</w:t>
-            </w:r>
-          </w:p>
-        </w:tc>
-        <w:tc>
-          <w:tcPr>
-            <w:tcW w:type="dxa" w:w="2160"/>
-          </w:tcPr>
-          <w:p>
-            <w:r>
-              <w:t>Implementado</w:t>
-            </w:r>
-          </w:p>
-        </w:tc>
-        <w:tc>
-          <w:tcPr>
-            <w:tcW w:type="dxa" w:w="2160"/>
-          </w:tcPr>
-          <w:p>
-            <w:r>
-              <w:t>Se ampliaron campos de Paciente para contacto, datos administrativos, riesgo, emergencia, derivación, diagnóstico sospechado, medicación, frecuencia y otros datos clínicos.</w:t>
-            </w:r>
-          </w:p>
-        </w:tc>
-      </w:tr>
-      <w:tr>
-        <w:tc>
-          <w:tcPr>
-            <w:tcW w:type="dxa" w:w="2160"/>
-          </w:tcPr>
-          <w:p>
-            <w:r>
-              <w:t>3</w:t>
-            </w:r>
-          </w:p>
-        </w:tc>
-        <w:tc>
-          <w:tcPr>
-            <w:tcW w:type="dxa" w:w="2160"/>
-          </w:tcPr>
-          <w:p>
-            <w:r>
-              <w:t>Objetivos de intervención</w:t>
-            </w:r>
-          </w:p>
-        </w:tc>
-        <w:tc>
-          <w:tcPr>
-            <w:tcW w:type="dxa" w:w="2160"/>
-          </w:tcPr>
-          <w:p>
-            <w:r>
-              <w:t>Implementado</w:t>
-            </w:r>
-          </w:p>
-        </w:tc>
-        <w:tc>
-          <w:tcPr>
-            <w:tcW w:type="dxa" w:w="2160"/>
-          </w:tcPr>
-          <w:p>
-            <w:r>
-              <w:t>Se agregó objetivos_intervencion en la ficha del paciente y se muestra como bloque clínico propio. También se incluye como contexto del asistente IA.</w:t>
-            </w:r>
-          </w:p>
-        </w:tc>
-      </w:tr>
-      <w:tr>
-        <w:tc>
-          <w:tcPr>
-            <w:tcW w:type="dxa" w:w="2160"/>
-          </w:tcPr>
-          <w:p>
-            <w:r>
-              <w:t>4</w:t>
-            </w:r>
-          </w:p>
-        </w:tc>
-        <w:tc>
-          <w:tcPr>
-            <w:tcW w:type="dxa" w:w="2160"/>
-          </w:tcPr>
-          <w:p>
-            <w:r>
-              <w:t>Prompt IA estructurado</w:t>
-            </w:r>
-          </w:p>
-        </w:tc>
-        <w:tc>
-          <w:tcPr>
-            <w:tcW w:type="dxa" w:w="2160"/>
-          </w:tcPr>
-          <w:p>
-            <w:r>
-              <w:t>Implementado</w:t>
-            </w:r>
-          </w:p>
-        </w:tc>
-        <w:tc>
-          <w:tcPr>
-            <w:tcW w:type="dxa" w:w="2160"/>
-          </w:tcPr>
-          <w:p>
-            <w:r>
-              <w:t>El asistente ahora responde con enfoque clínico prudente, separando evidencia e inferencias, evitando diagnósticos definitivos y usando bloques estructurados.</w:t>
-            </w:r>
-          </w:p>
-        </w:tc>
-      </w:tr>
-      <w:tr>
-        <w:tc>
-          <w:tcPr>
-            <w:tcW w:type="dxa" w:w="2160"/>
-          </w:tcPr>
-          <w:p>
-            <w:r>
-              <w:t>5</w:t>
-            </w:r>
-          </w:p>
-        </w:tc>
-        <w:tc>
-          <w:tcPr>
-            <w:tcW w:type="dxa" w:w="2160"/>
-          </w:tcPr>
-          <w:p>
-            <w:r>
-              <w:t>Guardar respuesta IA como informe</w:t>
-            </w:r>
-          </w:p>
-        </w:tc>
-        <w:tc>
-          <w:tcPr>
-            <w:tcW w:type="dxa" w:w="2160"/>
-          </w:tcPr>
-          <w:p>
-            <w:r>
-              <w:t>Implementado</w:t>
-            </w:r>
-          </w:p>
-        </w:tc>
-        <w:tc>
-          <w:tcPr>
-            <w:tcW w:type="dxa" w:w="2160"/>
-          </w:tcPr>
-          <w:p>
-            <w:r>
-              <w:t>Se creó InformeIA, endpoint para guardar respuestas del asistente y sección de informes IA guardados en la ficha del paciente, con apertura, eliminación y descarga PDF/Word.</w:t>
-            </w:r>
-          </w:p>
-        </w:tc>
-      </w:tr>
-      <w:tr>
-        <w:tc>
-          <w:tcPr>
-            <w:tcW w:type="dxa" w:w="2160"/>
-          </w:tcPr>
-          <w:p>
-            <w:r>
-              <w:t>6</w:t>
-            </w:r>
-          </w:p>
-        </w:tc>
-        <w:tc>
-          <w:tcPr>
-            <w:tcW w:type="dxa" w:w="2160"/>
-          </w:tcPr>
-          <w:p>
-            <w:r>
-              <w:t>Consentimiento informado básico</w:t>
-            </w:r>
-          </w:p>
-        </w:tc>
-        <w:tc>
-          <w:tcPr>
-            <w:tcW w:type="dxa" w:w="2160"/>
-          </w:tcPr>
-          <w:p>
-            <w:r>
-              <w:t>Pendiente</w:t>
-            </w:r>
-          </w:p>
-        </w:tc>
-        <w:tc>
-          <w:tcPr>
-            <w:tcW w:type="dxa" w:w="2160"/>
-          </w:tcPr>
-          <w:p>
-            <w:r>
-              <w:t>Se mantiene fuera de esta iteración.</w:t>
-            </w:r>
-          </w:p>
-        </w:tc>
-      </w:tr>
-      <w:tr>
-        <w:tc>
-          <w:tcPr>
-            <w:tcW w:type="dxa" w:w="2160"/>
-          </w:tcPr>
-          <w:p>
-            <w:r>
-              <w:t>7</w:t>
-            </w:r>
-          </w:p>
-        </w:tc>
-        <w:tc>
-          <w:tcPr>
-            <w:tcW w:type="dxa" w:w="2160"/>
-          </w:tcPr>
-          <w:p>
-            <w:r>
-              <w:t>Primer test digitalizado</w:t>
-            </w:r>
-          </w:p>
-        </w:tc>
-        <w:tc>
-          <w:tcPr>
-            <w:tcW w:type="dxa" w:w="2160"/>
-          </w:tcPr>
-          <w:p>
-            <w:r>
-              <w:t>Pendiente</w:t>
-            </w:r>
-          </w:p>
-        </w:tc>
-        <w:tc>
-          <w:tcPr>
-            <w:tcW w:type="dxa" w:w="2160"/>
-          </w:tcPr>
-          <w:p>
-            <w:r>
-              <w:t>Se mantiene fuera de esta iteración.</w:t>
-            </w:r>
-          </w:p>
-        </w:tc>
-      </w:tr>
-    </w:tbl>
+        <w:t>Actualización posterior a la segunda iteración de desarrollo: se implementaron los primeros cinco puntos priorizados y luego se incorporó el primer test digitalizado. Consentimiento informado queda pendiente para una etapa posterior.</w:t>
+      </w:r>
+    </w:p>
+    <w:p>
+      <w:r>
+        <w:t>| Prioridad | Oportunidad | Estado | Implementación realizada |</w:t>
+      </w:r>
+    </w:p>
+    <w:p>
+      <w:r>
+        <w:t>| 1 | Número correlativo de sesión | Implementado | Se agregó `numero_sesion` a `Sesion`, con backfill de sesiones existentes y asignación automática para sesiones presenciales/remotas. Se muestra en lista, detalle y PDF. |</w:t>
+      </w:r>
+    </w:p>
+    <w:p>
+      <w:r>
+        <w:t>| 2 | Ficha clínica ampliada | Implementado | Se ampliaron campos de `Paciente` para contacto, datos administrativos, riesgo, emergencia, derivación, diagnóstico sospechado, medicación, frecuencia y otros datos clínicos. |</w:t>
+      </w:r>
+    </w:p>
+    <w:p>
+      <w:r>
+        <w:t>| 3 | Objetivos de intervención | Implementado | Se agregó `objetivos_intervencion` en la ficha del paciente y se muestra como bloque clínico propio. También se incluye como contexto del asistente IA. |</w:t>
+      </w:r>
+    </w:p>
+    <w:p>
+      <w:r>
+        <w:t>| 4 | Prompt IA estructurado | Implementado | El asistente ahora responde con enfoque clínico prudente, separando evidencia e inferencias, evitando diagnósticos definitivos y usando bloques estructurados. |</w:t>
+      </w:r>
+    </w:p>
+    <w:p>
+      <w:r>
+        <w:t>| 5 | Guardar respuesta IA como informe | Implementado | Se creó `InformeIA`, endpoint para guardar respuestas del asistente y sección de informes IA guardados en la ficha del paciente, con apertura, eliminación y descarga PDF/Word. |</w:t>
+      </w:r>
+    </w:p>
+    <w:p>
+      <w:r>
+        <w:t>| 6 | Consentimiento informado básico | Pendiente | Se mantiene fuera de esta iteración. |</w:t>
+      </w:r>
+    </w:p>
+    <w:p>
+      <w:r>
+        <w:t>| 7 | Primer test digitalizado | Implementado | Se creó el Test de Creencias Ellis con catálogo, vista previa, link público con token, expiración de 7 días, uso único, respuesta sin autenticación, cálculo automático, sesión clínica tipo test, observación IA prudente con apoyo DSM-5, descarga PDF/Word y eliminación. El envío por correo quedó preparado y en espera de credenciales SMTP. |</w:t>
+      </w:r>
+    </w:p>
     <w:p>
       <w:pPr>
         <w:pStyle w:val="Heading3"/>
@@ -4536,251 +2954,41 @@
         <w:t>7.2 Implementar después</w:t>
       </w:r>
     </w:p>
-    <w:tbl>
-      <w:tblPr>
-        <w:tblStyle w:val="TableGrid"/>
-        <w:tblW w:type="auto" w:w="0"/>
-        <w:tblLook w:firstColumn="1" w:firstRow="1" w:lastColumn="0" w:lastRow="0" w:noHBand="0" w:noVBand="1" w:val="04A0"/>
-      </w:tblPr>
-      <w:tblGrid>
-        <w:gridCol w:w="2880"/>
-        <w:gridCol w:w="2880"/>
-        <w:gridCol w:w="2880"/>
-      </w:tblGrid>
-      <w:tr>
-        <w:tc>
-          <w:tcPr>
-            <w:tcW w:type="dxa" w:w="2880"/>
-          </w:tcPr>
-          <w:p>
-            <w:r>
-              <w:rPr>
-                <w:b/>
-              </w:rPr>
-              <w:t>Prioridad</w:t>
-            </w:r>
-          </w:p>
-        </w:tc>
-        <w:tc>
-          <w:tcPr>
-            <w:tcW w:type="dxa" w:w="2880"/>
-          </w:tcPr>
-          <w:p>
-            <w:r>
-              <w:rPr>
-                <w:b/>
-              </w:rPr>
-              <w:t>Oportunidad</w:t>
-            </w:r>
-          </w:p>
-        </w:tc>
-        <w:tc>
-          <w:tcPr>
-            <w:tcW w:type="dxa" w:w="2880"/>
-          </w:tcPr>
-          <w:p>
-            <w:r>
-              <w:rPr>
-                <w:b/>
-              </w:rPr>
-              <w:t>Razón</w:t>
-            </w:r>
-          </w:p>
-        </w:tc>
-      </w:tr>
-      <w:tr>
-        <w:tc>
-          <w:tcPr>
-            <w:tcW w:type="dxa" w:w="2880"/>
-          </w:tcPr>
-          <w:p>
-            <w:r>
-              <w:t>8</w:t>
-            </w:r>
-          </w:p>
-        </w:tc>
-        <w:tc>
-          <w:tcPr>
-            <w:tcW w:type="dxa" w:w="2880"/>
-          </w:tcPr>
-          <w:p>
-            <w:r>
-              <w:t>Link público para responder tests</w:t>
-            </w:r>
-          </w:p>
-        </w:tc>
-        <w:tc>
-          <w:tcPr>
-            <w:tcW w:type="dxa" w:w="2880"/>
-          </w:tcPr>
-          <w:p>
-            <w:r>
-              <w:t>Necesario después de definir primer test</w:t>
-            </w:r>
-          </w:p>
-        </w:tc>
-      </w:tr>
-      <w:tr>
-        <w:tc>
-          <w:tcPr>
-            <w:tcW w:type="dxa" w:w="2880"/>
-          </w:tcPr>
-          <w:p>
-            <w:r>
-              <w:t>9</w:t>
-            </w:r>
-          </w:p>
-        </w:tc>
-        <w:tc>
-          <w:tcPr>
-            <w:tcW w:type="dxa" w:w="2880"/>
-          </w:tcPr>
-          <w:p>
-            <w:r>
-              <w:t>Timeline clínico</w:t>
-            </w:r>
-          </w:p>
-        </w:tc>
-        <w:tc>
-          <w:tcPr>
-            <w:tcW w:type="dxa" w:w="2880"/>
-          </w:tcPr>
-          <w:p>
-            <w:r>
-              <w:t>Mejora experiencia cuando hay muchas sesiones</w:t>
-            </w:r>
-          </w:p>
-        </w:tc>
-      </w:tr>
-      <w:tr>
-        <w:tc>
-          <w:tcPr>
-            <w:tcW w:type="dxa" w:w="2880"/>
-          </w:tcPr>
-          <w:p>
-            <w:r>
-              <w:t>10</w:t>
-            </w:r>
-          </w:p>
-        </w:tc>
-        <w:tc>
-          <w:tcPr>
-            <w:tcW w:type="dxa" w:w="2880"/>
-          </w:tcPr>
-          <w:p>
-            <w:r>
-              <w:t>Agenda básica</w:t>
-            </w:r>
-          </w:p>
-        </w:tc>
-        <w:tc>
-          <w:tcPr>
-            <w:tcW w:type="dxa" w:w="2880"/>
-          </w:tcPr>
-          <w:p>
-            <w:r>
-              <w:t>Expande la app hacia operación diaria</w:t>
-            </w:r>
-          </w:p>
-        </w:tc>
-      </w:tr>
-      <w:tr>
-        <w:tc>
-          <w:tcPr>
-            <w:tcW w:type="dxa" w:w="2880"/>
-          </w:tcPr>
-          <w:p>
-            <w:r>
-              <w:t>11</w:t>
-            </w:r>
-          </w:p>
-        </w:tc>
-        <w:tc>
-          <w:tcPr>
-            <w:tcW w:type="dxa" w:w="2880"/>
-          </w:tcPr>
-          <w:p>
-            <w:r>
-              <w:t>Pagos básicos</w:t>
-            </w:r>
-          </w:p>
-        </w:tc>
-        <w:tc>
-          <w:tcPr>
-            <w:tcW w:type="dxa" w:w="2880"/>
-          </w:tcPr>
-          <w:p>
-            <w:r>
-              <w:t>Aumenta valor administrativo</w:t>
-            </w:r>
-          </w:p>
-        </w:tc>
-      </w:tr>
-      <w:tr>
-        <w:tc>
-          <w:tcPr>
-            <w:tcW w:type="dxa" w:w="2880"/>
-          </w:tcPr>
-          <w:p>
-            <w:r>
-              <w:t>12</w:t>
-            </w:r>
-          </w:p>
-        </w:tc>
-        <w:tc>
-          <w:tcPr>
-            <w:tcW w:type="dxa" w:w="2880"/>
-          </w:tcPr>
-          <w:p>
-            <w:r>
-              <w:t>Analítica</w:t>
-            </w:r>
-          </w:p>
-        </w:tc>
-        <w:tc>
-          <w:tcPr>
-            <w:tcW w:type="dxa" w:w="2880"/>
-          </w:tcPr>
-          <w:p>
-            <w:r>
-              <w:t>Útil para venta y gestión, pero no bloquea MVP clínico</w:t>
-            </w:r>
-          </w:p>
-        </w:tc>
-      </w:tr>
-      <w:tr>
-        <w:tc>
-          <w:tcPr>
-            <w:tcW w:type="dxa" w:w="2880"/>
-          </w:tcPr>
-          <w:p>
-            <w:r>
-              <w:t>13</w:t>
-            </w:r>
-          </w:p>
-        </w:tc>
-        <w:tc>
-          <w:tcPr>
-            <w:tcW w:type="dxa" w:w="2880"/>
-          </w:tcPr>
-          <w:p>
-            <w:r>
-              <w:t>DSM-5 con RAG</w:t>
-            </w:r>
-          </w:p>
-        </w:tc>
-        <w:tc>
-          <w:tcPr>
-            <w:tcW w:type="dxa" w:w="2880"/>
-          </w:tcPr>
-          <w:p>
-            <w:r>
-              <w:t>Alto valor, pero requiere cuidado legal y clínico</w:t>
-            </w:r>
-          </w:p>
-        </w:tc>
-      </w:tr>
-    </w:tbl>
+    <w:p>
+      <w:r>
+        <w:t>| Prioridad | Oportunidad | Razón |</w:t>
+      </w:r>
+    </w:p>
+    <w:p>
+      <w:r>
+        <w:t>| 8 | Link público para responder tests | Implementado dentro del primer módulo de test; queda pendiente conectar SMTP real |</w:t>
+      </w:r>
+    </w:p>
+    <w:p>
+      <w:r>
+        <w:t>| 9 | Timeline clínico | Mejora experiencia cuando hay muchas sesiones |</w:t>
+      </w:r>
+    </w:p>
+    <w:p>
+      <w:r>
+        <w:t>| 10 | Agenda básica | Expande la app hacia operación diaria |</w:t>
+      </w:r>
+    </w:p>
+    <w:p>
+      <w:r>
+        <w:t>| 11 | Pagos básicos | Aumenta valor administrativo |</w:t>
+      </w:r>
+    </w:p>
+    <w:p>
+      <w:r>
+        <w:t>| 12 | Analítica | Útil para venta y gestión, pero no bloquea MVP clínico |</w:t>
+      </w:r>
+    </w:p>
+    <w:p>
+      <w:r>
+        <w:t>| 13 | DSM-5 con RAG | Alto valor, pero requiere cuidado legal y clínico |</w:t>
+      </w:r>
+    </w:p>
     <w:p>
       <w:pPr>
         <w:pStyle w:val="Heading3"/>
@@ -4789,155 +2997,36 @@
         <w:t>7.3 Dejar como visión futura</w:t>
       </w:r>
     </w:p>
-    <w:tbl>
-      <w:tblPr>
-        <w:tblStyle w:val="TableGrid"/>
-        <w:tblW w:type="auto" w:w="0"/>
-        <w:tblLook w:firstColumn="1" w:firstRow="1" w:lastColumn="0" w:lastRow="0" w:noHBand="0" w:noVBand="1" w:val="04A0"/>
-      </w:tblPr>
-      <w:tblGrid>
-        <w:gridCol w:w="4320"/>
-        <w:gridCol w:w="4320"/>
-      </w:tblGrid>
-      <w:tr>
-        <w:tc>
-          <w:tcPr>
-            <w:tcW w:type="dxa" w:w="4320"/>
-          </w:tcPr>
-          <w:p>
-            <w:r>
-              <w:rPr>
-                <w:b/>
-              </w:rPr>
-              <w:t>Oportunidad</w:t>
-            </w:r>
-          </w:p>
-        </w:tc>
-        <w:tc>
-          <w:tcPr>
-            <w:tcW w:type="dxa" w:w="4320"/>
-          </w:tcPr>
-          <w:p>
-            <w:r>
-              <w:rPr>
-                <w:b/>
-              </w:rPr>
-              <w:t>Motivo para postergar</w:t>
-            </w:r>
-          </w:p>
-        </w:tc>
-      </w:tr>
-      <w:tr>
-        <w:tc>
-          <w:tcPr>
-            <w:tcW w:type="dxa" w:w="4320"/>
-          </w:tcPr>
-          <w:p>
-            <w:r>
-              <w:t>Videollamada propia</w:t>
-            </w:r>
-          </w:p>
-        </w:tc>
-        <w:tc>
-          <w:tcPr>
-            <w:tcW w:type="dxa" w:w="4320"/>
-          </w:tcPr>
-          <w:p>
-            <w:r>
-              <w:t>Alto esfuerzo técnico; ya existe camino con Meet/Zoom</w:t>
-            </w:r>
-          </w:p>
-        </w:tc>
-      </w:tr>
-      <w:tr>
-        <w:tc>
-          <w:tcPr>
-            <w:tcW w:type="dxa" w:w="4320"/>
-          </w:tcPr>
-          <w:p>
-            <w:r>
-              <w:t>Boleta automática</w:t>
-            </w:r>
-          </w:p>
-        </w:tc>
-        <w:tc>
-          <w:tcPr>
-            <w:tcW w:type="dxa" w:w="4320"/>
-          </w:tcPr>
-          <w:p>
-            <w:r>
-              <w:t>Requiere proveedor/API y validaciones fiscales</w:t>
-            </w:r>
-          </w:p>
-        </w:tc>
-      </w:tr>
-      <w:tr>
-        <w:tc>
-          <w:tcPr>
-            <w:tcW w:type="dxa" w:w="4320"/>
-          </w:tcPr>
-          <w:p>
-            <w:r>
-              <w:t>Marketplace de tests</w:t>
-            </w:r>
-          </w:p>
-        </w:tc>
-        <w:tc>
-          <w:tcPr>
-            <w:tcW w:type="dxa" w:w="4320"/>
-          </w:tcPr>
-          <w:p>
-            <w:r>
-              <w:t>Depende de licencias y biblioteca inicial</w:t>
-            </w:r>
-          </w:p>
-        </w:tc>
-      </w:tr>
-      <w:tr>
-        <w:tc>
-          <w:tcPr>
-            <w:tcW w:type="dxa" w:w="4320"/>
-          </w:tcPr>
-          <w:p>
-            <w:r>
-              <w:t>Tests proyectivos avanzados</w:t>
-            </w:r>
-          </w:p>
-        </w:tc>
-        <w:tc>
-          <w:tcPr>
-            <w:tcW w:type="dxa" w:w="4320"/>
-          </w:tcPr>
-          <w:p>
-            <w:r>
-              <w:t>Requieren interpretación y observación profesional compleja</w:t>
-            </w:r>
-          </w:p>
-        </w:tc>
-      </w:tr>
-      <w:tr>
-        <w:tc>
-          <w:tcPr>
-            <w:tcW w:type="dxa" w:w="4320"/>
-          </w:tcPr>
-          <w:p>
-            <w:r>
-              <w:t>Portal completo del paciente</w:t>
-            </w:r>
-          </w:p>
-        </w:tc>
-        <w:tc>
-          <w:tcPr>
-            <w:tcW w:type="dxa" w:w="4320"/>
-          </w:tcPr>
-          <w:p>
-            <w:r>
-              <w:t>Puede aumentar riesgos y complejidad de privacidad</w:t>
-            </w:r>
-          </w:p>
-        </w:tc>
-      </w:tr>
-    </w:tbl>
+    <w:p>
+      <w:r>
+        <w:t>| Oportunidad | Motivo para postergar |</w:t>
+      </w:r>
+    </w:p>
+    <w:p>
+      <w:r>
+        <w:t>| Videollamada propia | Alto esfuerzo técnico; ya existe camino con Meet/Zoom |</w:t>
+      </w:r>
+    </w:p>
+    <w:p>
+      <w:r>
+        <w:t>| Boleta automática | Requiere proveedor/API y validaciones fiscales |</w:t>
+      </w:r>
+    </w:p>
+    <w:p>
+      <w:r>
+        <w:t>| Marketplace de tests | Depende de licencias y biblioteca inicial |</w:t>
+      </w:r>
+    </w:p>
+    <w:p>
+      <w:r>
+        <w:t>| Tests proyectivos avanzados | Requieren interpretación y observación profesional compleja |</w:t>
+      </w:r>
+    </w:p>
+    <w:p>
+      <w:r>
+        <w:t>| Portal completo del paciente | Puede aumentar riesgos y complejidad de privacidad |</w:t>
+      </w:r>
+    </w:p>
     <w:p>
       <w:pPr>
         <w:pStyle w:val="Heading2"/>
@@ -4969,7 +3058,7 @@
         <w:pStyle w:val="ListBullet"/>
       </w:pPr>
       <w:r>
-        <w:t>Agregar numero_sesion a Sesion.</w:t>
+        <w:t>Agregar `numero_sesion` a `Sesion`.</w:t>
       </w:r>
     </w:p>
     <w:p>
@@ -4985,7 +3074,7 @@
         <w:pStyle w:val="ListBullet"/>
       </w:pPr>
       <w:r>
-        <w:t>Renombrar botones: Sesión presencial y Sesión remota.</w:t>
+        <w:t>Renombrar botones: `Sesión presencial` y `Sesión remota`.</w:t>
       </w:r>
     </w:p>
     <w:p>
@@ -5001,7 +3090,7 @@
         <w:pStyle w:val="ListBullet"/>
       </w:pPr>
       <w:r>
-        <w:t>Agregar objetivos_intervencion en paciente.</w:t>
+        <w:t>Agregar `objetivos_intervencion` en paciente.</w:t>
       </w:r>
     </w:p>
     <w:p>
@@ -5051,63 +3140,71 @@
         <w:pStyle w:val="ListBullet"/>
       </w:pPr>
       <w:r>
-        <w:t>Recibir de Lina preguntas, reglas e interpretación.</w:t>
-      </w:r>
-    </w:p>
-    <w:p>
-      <w:pPr>
-        <w:pStyle w:val="ListBullet"/>
-      </w:pPr>
-      <w:r>
-        <w:t>Seleccionar el test más simple para primer MVP.</w:t>
-      </w:r>
-    </w:p>
-    <w:p>
-      <w:pPr>
-        <w:pStyle w:val="ListBullet"/>
-      </w:pPr>
-      <w:r>
-        <w:t>Crear modelo de definición de test.</w:t>
-      </w:r>
-    </w:p>
-    <w:p>
-      <w:pPr>
-        <w:pStyle w:val="ListBullet"/>
-      </w:pPr>
-      <w:r>
-        <w:t>Crear modelo de aplicación de test por paciente.</w:t>
-      </w:r>
-    </w:p>
-    <w:p>
-      <w:pPr>
-        <w:pStyle w:val="ListBullet"/>
-      </w:pPr>
-      <w:r>
-        <w:t>Crear link público con token.</w:t>
-      </w:r>
-    </w:p>
-    <w:p>
-      <w:pPr>
-        <w:pStyle w:val="ListBullet"/>
-      </w:pPr>
-      <w:r>
-        <w:t>Calcular puntaje por código.</w:t>
-      </w:r>
-    </w:p>
-    <w:p>
-      <w:pPr>
-        <w:pStyle w:val="ListBullet"/>
-      </w:pPr>
-      <w:r>
-        <w:t>Mostrar resultado al psicólogo.</w:t>
-      </w:r>
-    </w:p>
-    <w:p>
-      <w:pPr>
-        <w:pStyle w:val="ListBullet"/>
-      </w:pPr>
-      <w:r>
-        <w:t>Permitir generar informe IA del resultado.</w:t>
+        <w:t>Test de Creencias Ellis digitalizado como primer MVP.</w:t>
+      </w:r>
+    </w:p>
+    <w:p>
+      <w:pPr>
+        <w:pStyle w:val="ListBullet"/>
+      </w:pPr>
+      <w:r>
+        <w:t>Catálogo de tests con vista previa de preguntas y vista paciente.</w:t>
+      </w:r>
+    </w:p>
+    <w:p>
+      <w:pPr>
+        <w:pStyle w:val="ListBullet"/>
+      </w:pPr>
+      <w:r>
+        <w:t>Aplicación de test por paciente con token público, expiración de 7 días y uso único.</w:t>
+      </w:r>
+    </w:p>
+    <w:p>
+      <w:pPr>
+        <w:pStyle w:val="ListBullet"/>
+      </w:pPr>
+      <w:r>
+        <w:t>Cálculo automático de puntajes por dimensión.</w:t>
+      </w:r>
+    </w:p>
+    <w:p>
+      <w:pPr>
+        <w:pStyle w:val="ListBullet"/>
+      </w:pPr>
+      <w:r>
+        <w:t>Resultado guardado como sesión clínica tipo test dentro de la ficha.</w:t>
+      </w:r>
+    </w:p>
+    <w:p>
+      <w:pPr>
+        <w:pStyle w:val="ListBullet"/>
+      </w:pPr>
+      <w:r>
+        <w:t>Observación IA prudente apoyada en DSM-5, sin diagnóstico automático.</w:t>
+      </w:r>
+    </w:p>
+    <w:p>
+      <w:pPr>
+        <w:pStyle w:val="ListBullet"/>
+      </w:pPr>
+      <w:r>
+        <w:t>Resultados disponibles como conocimiento para el chat IA mediante segmentos con embeddings.</w:t>
+      </w:r>
+    </w:p>
+    <w:p>
+      <w:pPr>
+        <w:pStyle w:val="ListBullet"/>
+      </w:pPr>
+      <w:r>
+        <w:t>Descarga PDF/Word y eliminación del resultado desde la sesión.</w:t>
+      </w:r>
+    </w:p>
+    <w:p>
+      <w:pPr>
+        <w:pStyle w:val="ListBullet"/>
+      </w:pPr>
+      <w:r>
+        <w:t>Envío por correo preparado; pendiente de credenciales SMTP.</w:t>
       </w:r>
     </w:p>
     <w:p>
@@ -5252,7 +3349,7 @@
         <w:pStyle w:val="Heading3"/>
       </w:pPr>
       <w:r>
-        <w:t>9.1 Extender Paciente</w:t>
+        <w:t>9.1 Extender `Paciente`</w:t>
       </w:r>
     </w:p>
     <w:p>
@@ -5265,159 +3362,159 @@
         <w:pStyle w:val="ListBullet"/>
       </w:pPr>
       <w:r>
-        <w:t>telefono_whatsapp</w:t>
-      </w:r>
-    </w:p>
-    <w:p>
-      <w:pPr>
-        <w:pStyle w:val="ListBullet"/>
-      </w:pPr>
-      <w:r>
-        <w:t>email_contacto</w:t>
-      </w:r>
-    </w:p>
-    <w:p>
-      <w:pPr>
-        <w:pStyle w:val="ListBullet"/>
-      </w:pPr>
-      <w:r>
-        <w:t>nacionalidad</w:t>
-      </w:r>
-    </w:p>
-    <w:p>
-      <w:pPr>
-        <w:pStyle w:val="ListBullet"/>
-      </w:pPr>
-      <w:r>
-        <w:t>religion</w:t>
-      </w:r>
-    </w:p>
-    <w:p>
-      <w:pPr>
-        <w:pStyle w:val="ListBullet"/>
-      </w:pPr>
-      <w:r>
-        <w:t>direccion</w:t>
-      </w:r>
-    </w:p>
-    <w:p>
-      <w:pPr>
-        <w:pStyle w:val="ListBullet"/>
-      </w:pPr>
-      <w:r>
-        <w:t>comuna</w:t>
-      </w:r>
-    </w:p>
-    <w:p>
-      <w:pPr>
-        <w:pStyle w:val="ListBullet"/>
-      </w:pPr>
-      <w:r>
-        <w:t>prevision</w:t>
-      </w:r>
-    </w:p>
-    <w:p>
-      <w:pPr>
-        <w:pStyle w:val="ListBullet"/>
-      </w:pPr>
-      <w:r>
-        <w:t>es_menor_edad</w:t>
-      </w:r>
-    </w:p>
-    <w:p>
-      <w:pPr>
-        <w:pStyle w:val="ListBullet"/>
-      </w:pPr>
-      <w:r>
-        <w:t>nombre_tutor</w:t>
-      </w:r>
-    </w:p>
-    <w:p>
-      <w:pPr>
-        <w:pStyle w:val="ListBullet"/>
-      </w:pPr>
-      <w:r>
-        <w:t>telefono_tutor</w:t>
-      </w:r>
-    </w:p>
-    <w:p>
-      <w:pPr>
-        <w:pStyle w:val="ListBullet"/>
-      </w:pPr>
-      <w:r>
-        <w:t>contacto_emergencia_nombre</w:t>
-      </w:r>
-    </w:p>
-    <w:p>
-      <w:pPr>
-        <w:pStyle w:val="ListBullet"/>
-      </w:pPr>
-      <w:r>
-        <w:t>contacto_emergencia_telefono</w:t>
-      </w:r>
-    </w:p>
-    <w:p>
-      <w:pPr>
-        <w:pStyle w:val="ListBullet"/>
-      </w:pPr>
-      <w:r>
-        <w:t>origen_consulta</w:t>
-      </w:r>
-    </w:p>
-    <w:p>
-      <w:pPr>
-        <w:pStyle w:val="ListBullet"/>
-      </w:pPr>
-      <w:r>
-        <w:t>derivacion_interconsulta</w:t>
-      </w:r>
-    </w:p>
-    <w:p>
-      <w:pPr>
-        <w:pStyle w:val="ListBullet"/>
-      </w:pPr>
-      <w:r>
-        <w:t>diagnostico_sospechado</w:t>
-      </w:r>
-    </w:p>
-    <w:p>
-      <w:pPr>
-        <w:pStyle w:val="ListBullet"/>
-      </w:pPr>
-      <w:r>
-        <w:t>medicacion_actual</w:t>
-      </w:r>
-    </w:p>
-    <w:p>
-      <w:pPr>
-        <w:pStyle w:val="ListBullet"/>
-      </w:pPr>
-      <w:r>
-        <w:t>riesgo_suicida</w:t>
-      </w:r>
-    </w:p>
-    <w:p>
-      <w:pPr>
-        <w:pStyle w:val="ListBullet"/>
-      </w:pPr>
-      <w:r>
-        <w:t>frecuencia_atencion</w:t>
-      </w:r>
-    </w:p>
-    <w:p>
-      <w:pPr>
-        <w:pStyle w:val="ListBullet"/>
-      </w:pPr>
-      <w:r>
-        <w:t>tarifa_diferenciada</w:t>
-      </w:r>
-    </w:p>
-    <w:p>
-      <w:pPr>
-        <w:pStyle w:val="ListBullet"/>
-      </w:pPr>
-      <w:r>
-        <w:t>objetivos_intervencion</w:t>
+        <w:t>`telefono_whatsapp`</w:t>
+      </w:r>
+    </w:p>
+    <w:p>
+      <w:pPr>
+        <w:pStyle w:val="ListBullet"/>
+      </w:pPr>
+      <w:r>
+        <w:t>`email_contacto`</w:t>
+      </w:r>
+    </w:p>
+    <w:p>
+      <w:pPr>
+        <w:pStyle w:val="ListBullet"/>
+      </w:pPr>
+      <w:r>
+        <w:t>`nacionalidad`</w:t>
+      </w:r>
+    </w:p>
+    <w:p>
+      <w:pPr>
+        <w:pStyle w:val="ListBullet"/>
+      </w:pPr>
+      <w:r>
+        <w:t>`religion`</w:t>
+      </w:r>
+    </w:p>
+    <w:p>
+      <w:pPr>
+        <w:pStyle w:val="ListBullet"/>
+      </w:pPr>
+      <w:r>
+        <w:t>`direccion`</w:t>
+      </w:r>
+    </w:p>
+    <w:p>
+      <w:pPr>
+        <w:pStyle w:val="ListBullet"/>
+      </w:pPr>
+      <w:r>
+        <w:t>`comuna`</w:t>
+      </w:r>
+    </w:p>
+    <w:p>
+      <w:pPr>
+        <w:pStyle w:val="ListBullet"/>
+      </w:pPr>
+      <w:r>
+        <w:t>`prevision`</w:t>
+      </w:r>
+    </w:p>
+    <w:p>
+      <w:pPr>
+        <w:pStyle w:val="ListBullet"/>
+      </w:pPr>
+      <w:r>
+        <w:t>`es_menor_edad`</w:t>
+      </w:r>
+    </w:p>
+    <w:p>
+      <w:pPr>
+        <w:pStyle w:val="ListBullet"/>
+      </w:pPr>
+      <w:r>
+        <w:t>`nombre_tutor`</w:t>
+      </w:r>
+    </w:p>
+    <w:p>
+      <w:pPr>
+        <w:pStyle w:val="ListBullet"/>
+      </w:pPr>
+      <w:r>
+        <w:t>`telefono_tutor`</w:t>
+      </w:r>
+    </w:p>
+    <w:p>
+      <w:pPr>
+        <w:pStyle w:val="ListBullet"/>
+      </w:pPr>
+      <w:r>
+        <w:t>`contacto_emergencia_nombre`</w:t>
+      </w:r>
+    </w:p>
+    <w:p>
+      <w:pPr>
+        <w:pStyle w:val="ListBullet"/>
+      </w:pPr>
+      <w:r>
+        <w:t>`contacto_emergencia_telefono`</w:t>
+      </w:r>
+    </w:p>
+    <w:p>
+      <w:pPr>
+        <w:pStyle w:val="ListBullet"/>
+      </w:pPr>
+      <w:r>
+        <w:t>`origen_consulta`</w:t>
+      </w:r>
+    </w:p>
+    <w:p>
+      <w:pPr>
+        <w:pStyle w:val="ListBullet"/>
+      </w:pPr>
+      <w:r>
+        <w:t>`derivacion_interconsulta`</w:t>
+      </w:r>
+    </w:p>
+    <w:p>
+      <w:pPr>
+        <w:pStyle w:val="ListBullet"/>
+      </w:pPr>
+      <w:r>
+        <w:t>`diagnostico_sospechado`</w:t>
+      </w:r>
+    </w:p>
+    <w:p>
+      <w:pPr>
+        <w:pStyle w:val="ListBullet"/>
+      </w:pPr>
+      <w:r>
+        <w:t>`medicacion_actual`</w:t>
+      </w:r>
+    </w:p>
+    <w:p>
+      <w:pPr>
+        <w:pStyle w:val="ListBullet"/>
+      </w:pPr>
+      <w:r>
+        <w:t>`riesgo_suicida`</w:t>
+      </w:r>
+    </w:p>
+    <w:p>
+      <w:pPr>
+        <w:pStyle w:val="ListBullet"/>
+      </w:pPr>
+      <w:r>
+        <w:t>`frecuencia_atencion`</w:t>
+      </w:r>
+    </w:p>
+    <w:p>
+      <w:pPr>
+        <w:pStyle w:val="ListBullet"/>
+      </w:pPr>
+      <w:r>
+        <w:t>`tarifa_diferenciada`</w:t>
+      </w:r>
+    </w:p>
+    <w:p>
+      <w:pPr>
+        <w:pStyle w:val="ListBullet"/>
+      </w:pPr>
+      <w:r>
+        <w:t>`objetivos_intervencion`</w:t>
       </w:r>
     </w:p>
     <w:p>
@@ -5425,7 +3522,7 @@
         <w:pStyle w:val="Heading3"/>
       </w:pPr>
       <w:r>
-        <w:t>9.2 Extender Sesion</w:t>
+        <w:t>9.2 Extender `Sesion`</w:t>
       </w:r>
     </w:p>
     <w:p>
@@ -5438,55 +3535,55 @@
         <w:pStyle w:val="ListBullet"/>
       </w:pPr>
       <w:r>
-        <w:t>numero_sesion</w:t>
-      </w:r>
-    </w:p>
-    <w:p>
-      <w:pPr>
-        <w:pStyle w:val="ListBullet"/>
-      </w:pPr>
-      <w:r>
-        <w:t>tema_sesion</w:t>
-      </w:r>
-    </w:p>
-    <w:p>
-      <w:pPr>
-        <w:pStyle w:val="ListBullet"/>
-      </w:pPr>
-      <w:r>
-        <w:t>tecnica_aplicada</w:t>
-      </w:r>
-    </w:p>
-    <w:p>
-      <w:pPr>
-        <w:pStyle w:val="ListBullet"/>
-      </w:pPr>
-      <w:r>
-        <w:t>desarrollo_sesion</w:t>
-      </w:r>
-    </w:p>
-    <w:p>
-      <w:pPr>
-        <w:pStyle w:val="ListBullet"/>
-      </w:pPr>
-      <w:r>
-        <w:t>objetivo_proxima_sesion</w:t>
-      </w:r>
-    </w:p>
-    <w:p>
-      <w:pPr>
-        <w:pStyle w:val="ListBullet"/>
-      </w:pPr>
-      <w:r>
-        <w:t>tareas_paciente</w:t>
-      </w:r>
-    </w:p>
-    <w:p>
-      <w:pPr>
-        <w:pStyle w:val="ListBullet"/>
-      </w:pPr>
-      <w:r>
-        <w:t>riesgo_sesion</w:t>
+        <w:t>`numero_sesion`</w:t>
+      </w:r>
+    </w:p>
+    <w:p>
+      <w:pPr>
+        <w:pStyle w:val="ListBullet"/>
+      </w:pPr>
+      <w:r>
+        <w:t>`tema_sesion`</w:t>
+      </w:r>
+    </w:p>
+    <w:p>
+      <w:pPr>
+        <w:pStyle w:val="ListBullet"/>
+      </w:pPr>
+      <w:r>
+        <w:t>`tecnica_aplicada`</w:t>
+      </w:r>
+    </w:p>
+    <w:p>
+      <w:pPr>
+        <w:pStyle w:val="ListBullet"/>
+      </w:pPr>
+      <w:r>
+        <w:t>`desarrollo_sesion`</w:t>
+      </w:r>
+    </w:p>
+    <w:p>
+      <w:pPr>
+        <w:pStyle w:val="ListBullet"/>
+      </w:pPr>
+      <w:r>
+        <w:t>`objetivo_proxima_sesion`</w:t>
+      </w:r>
+    </w:p>
+    <w:p>
+      <w:pPr>
+        <w:pStyle w:val="ListBullet"/>
+      </w:pPr>
+      <w:r>
+        <w:t>`tareas_paciente`</w:t>
+      </w:r>
+    </w:p>
+    <w:p>
+      <w:pPr>
+        <w:pStyle w:val="ListBullet"/>
+      </w:pPr>
+      <w:r>
+        <w:t>`riesgo_sesion`</w:t>
       </w:r>
     </w:p>
     <w:p>
@@ -5494,7 +3591,7 @@
         <w:pStyle w:val="Heading3"/>
       </w:pPr>
       <w:r>
-        <w:t>9.3 Crear ConsentimientoInformado</w:t>
+        <w:t>9.3 Crear `ConsentimientoInformado`</w:t>
       </w:r>
     </w:p>
     <w:p>
@@ -5507,71 +3604,71 @@
         <w:pStyle w:val="ListBullet"/>
       </w:pPr>
       <w:r>
-        <w:t>paciente</w:t>
-      </w:r>
-    </w:p>
-    <w:p>
-      <w:pPr>
-        <w:pStyle w:val="ListBullet"/>
-      </w:pPr>
-      <w:r>
-        <w:t>psicologo</w:t>
-      </w:r>
-    </w:p>
-    <w:p>
-      <w:pPr>
-        <w:pStyle w:val="ListBullet"/>
-      </w:pPr>
-      <w:r>
-        <w:t>firmado</w:t>
-      </w:r>
-    </w:p>
-    <w:p>
-      <w:pPr>
-        <w:pStyle w:val="ListBullet"/>
-      </w:pPr>
-      <w:r>
-        <w:t>fecha_firma</w:t>
-      </w:r>
-    </w:p>
-    <w:p>
-      <w:pPr>
-        <w:pStyle w:val="ListBullet"/>
-      </w:pPr>
-      <w:r>
-        <w:t>version</w:t>
-      </w:r>
-    </w:p>
-    <w:p>
-      <w:pPr>
-        <w:pStyle w:val="ListBullet"/>
-      </w:pPr>
-      <w:r>
-        <w:t>autoriza_grabacion</w:t>
-      </w:r>
-    </w:p>
-    <w:p>
-      <w:pPr>
-        <w:pStyle w:val="ListBullet"/>
-      </w:pPr>
-      <w:r>
-        <w:t>autoriza_transcripcion</w:t>
-      </w:r>
-    </w:p>
-    <w:p>
-      <w:pPr>
-        <w:pStyle w:val="ListBullet"/>
-      </w:pPr>
-      <w:r>
-        <w:t>archivo_path</w:t>
-      </w:r>
-    </w:p>
-    <w:p>
-      <w:pPr>
-        <w:pStyle w:val="ListBullet"/>
-      </w:pPr>
-      <w:r>
-        <w:t>observaciones</w:t>
+        <w:t>`paciente`</w:t>
+      </w:r>
+    </w:p>
+    <w:p>
+      <w:pPr>
+        <w:pStyle w:val="ListBullet"/>
+      </w:pPr>
+      <w:r>
+        <w:t>`psicologo`</w:t>
+      </w:r>
+    </w:p>
+    <w:p>
+      <w:pPr>
+        <w:pStyle w:val="ListBullet"/>
+      </w:pPr>
+      <w:r>
+        <w:t>`firmado`</w:t>
+      </w:r>
+    </w:p>
+    <w:p>
+      <w:pPr>
+        <w:pStyle w:val="ListBullet"/>
+      </w:pPr>
+      <w:r>
+        <w:t>`fecha_firma`</w:t>
+      </w:r>
+    </w:p>
+    <w:p>
+      <w:pPr>
+        <w:pStyle w:val="ListBullet"/>
+      </w:pPr>
+      <w:r>
+        <w:t>`version`</w:t>
+      </w:r>
+    </w:p>
+    <w:p>
+      <w:pPr>
+        <w:pStyle w:val="ListBullet"/>
+      </w:pPr>
+      <w:r>
+        <w:t>`autoriza_grabacion`</w:t>
+      </w:r>
+    </w:p>
+    <w:p>
+      <w:pPr>
+        <w:pStyle w:val="ListBullet"/>
+      </w:pPr>
+      <w:r>
+        <w:t>`autoriza_transcripcion`</w:t>
+      </w:r>
+    </w:p>
+    <w:p>
+      <w:pPr>
+        <w:pStyle w:val="ListBullet"/>
+      </w:pPr>
+      <w:r>
+        <w:t>`archivo_path`</w:t>
+      </w:r>
+    </w:p>
+    <w:p>
+      <w:pPr>
+        <w:pStyle w:val="ListBullet"/>
+      </w:pPr>
+      <w:r>
+        <w:t>`observaciones`</w:t>
       </w:r>
     </w:p>
     <w:p>
@@ -5579,7 +3676,7 @@
         <w:pStyle w:val="Heading3"/>
       </w:pPr>
       <w:r>
-        <w:t>9.4 Crear InformeIA</w:t>
+        <w:t>9.4 Crear `InformeIA`</w:t>
       </w:r>
     </w:p>
     <w:p>
@@ -5592,79 +3689,79 @@
         <w:pStyle w:val="ListBullet"/>
       </w:pPr>
       <w:r>
-        <w:t>paciente</w:t>
-      </w:r>
-    </w:p>
-    <w:p>
-      <w:pPr>
-        <w:pStyle w:val="ListBullet"/>
-      </w:pPr>
-      <w:r>
-        <w:t>psicologo</w:t>
-      </w:r>
-    </w:p>
-    <w:p>
-      <w:pPr>
-        <w:pStyle w:val="ListBullet"/>
-      </w:pPr>
-      <w:r>
-        <w:t>sesion opcional.</w:t>
-      </w:r>
-    </w:p>
-    <w:p>
-      <w:pPr>
-        <w:pStyle w:val="ListBullet"/>
-      </w:pPr>
-      <w:r>
-        <w:t>tipo</w:t>
-      </w:r>
-    </w:p>
-    <w:p>
-      <w:pPr>
-        <w:pStyle w:val="ListBullet"/>
-      </w:pPr>
-      <w:r>
-        <w:t>titulo</w:t>
-      </w:r>
-    </w:p>
-    <w:p>
-      <w:pPr>
-        <w:pStyle w:val="ListBullet"/>
-      </w:pPr>
-      <w:r>
-        <w:t>contenido</w:t>
-      </w:r>
-    </w:p>
-    <w:p>
-      <w:pPr>
-        <w:pStyle w:val="ListBullet"/>
-      </w:pPr>
-      <w:r>
-        <w:t>fuentes_json</w:t>
-      </w:r>
-    </w:p>
-    <w:p>
-      <w:pPr>
-        <w:pStyle w:val="ListBullet"/>
-      </w:pPr>
-      <w:r>
-        <w:t>generado_desde_chat_mensaje opcional.</w:t>
-      </w:r>
-    </w:p>
-    <w:p>
-      <w:pPr>
-        <w:pStyle w:val="ListBullet"/>
-      </w:pPr>
-      <w:r>
-        <w:t>created_at</w:t>
-      </w:r>
-    </w:p>
-    <w:p>
-      <w:pPr>
-        <w:pStyle w:val="ListBullet"/>
-      </w:pPr>
-      <w:r>
-        <w:t>updated_at</w:t>
+        <w:t>`paciente`</w:t>
+      </w:r>
+    </w:p>
+    <w:p>
+      <w:pPr>
+        <w:pStyle w:val="ListBullet"/>
+      </w:pPr>
+      <w:r>
+        <w:t>`psicologo`</w:t>
+      </w:r>
+    </w:p>
+    <w:p>
+      <w:pPr>
+        <w:pStyle w:val="ListBullet"/>
+      </w:pPr>
+      <w:r>
+        <w:t>`sesion` opcional.</w:t>
+      </w:r>
+    </w:p>
+    <w:p>
+      <w:pPr>
+        <w:pStyle w:val="ListBullet"/>
+      </w:pPr>
+      <w:r>
+        <w:t>`tipo`</w:t>
+      </w:r>
+    </w:p>
+    <w:p>
+      <w:pPr>
+        <w:pStyle w:val="ListBullet"/>
+      </w:pPr>
+      <w:r>
+        <w:t>`titulo`</w:t>
+      </w:r>
+    </w:p>
+    <w:p>
+      <w:pPr>
+        <w:pStyle w:val="ListBullet"/>
+      </w:pPr>
+      <w:r>
+        <w:t>`contenido`</w:t>
+      </w:r>
+    </w:p>
+    <w:p>
+      <w:pPr>
+        <w:pStyle w:val="ListBullet"/>
+      </w:pPr>
+      <w:r>
+        <w:t>`fuentes_json`</w:t>
+      </w:r>
+    </w:p>
+    <w:p>
+      <w:pPr>
+        <w:pStyle w:val="ListBullet"/>
+      </w:pPr>
+      <w:r>
+        <w:t>`generado_desde_chat_mensaje` opcional.</w:t>
+      </w:r>
+    </w:p>
+    <w:p>
+      <w:pPr>
+        <w:pStyle w:val="ListBullet"/>
+      </w:pPr>
+      <w:r>
+        <w:t>`created_at`</w:t>
+      </w:r>
+    </w:p>
+    <w:p>
+      <w:pPr>
+        <w:pStyle w:val="ListBullet"/>
+      </w:pPr>
+      <w:r>
+        <w:t>`updated_at`</w:t>
       </w:r>
     </w:p>
     <w:p>
@@ -5685,63 +3782,63 @@
         <w:pStyle w:val="ListBullet"/>
       </w:pPr>
       <w:r>
-        <w:t>TestDefinicion</w:t>
-      </w:r>
-    </w:p>
-    <w:p>
-      <w:pPr>
-        <w:pStyle w:val="ListBullet"/>
-      </w:pPr>
-      <w:r>
-        <w:t>TestPregunta</w:t>
-      </w:r>
-    </w:p>
-    <w:p>
-      <w:pPr>
-        <w:pStyle w:val="ListBullet"/>
-      </w:pPr>
-      <w:r>
-        <w:t>TestAlternativa</w:t>
-      </w:r>
-    </w:p>
-    <w:p>
-      <w:pPr>
-        <w:pStyle w:val="ListBullet"/>
-      </w:pPr>
-      <w:r>
-        <w:t>TestEscala</w:t>
-      </w:r>
-    </w:p>
-    <w:p>
-      <w:pPr>
-        <w:pStyle w:val="ListBullet"/>
-      </w:pPr>
-      <w:r>
-        <w:t>TestReglaPuntuacion</w:t>
-      </w:r>
-    </w:p>
-    <w:p>
-      <w:pPr>
-        <w:pStyle w:val="ListBullet"/>
-      </w:pPr>
-      <w:r>
-        <w:t>TestAplicacion</w:t>
-      </w:r>
-    </w:p>
-    <w:p>
-      <w:pPr>
-        <w:pStyle w:val="ListBullet"/>
-      </w:pPr>
-      <w:r>
-        <w:t>TestRespuesta</w:t>
-      </w:r>
-    </w:p>
-    <w:p>
-      <w:pPr>
-        <w:pStyle w:val="ListBullet"/>
-      </w:pPr>
-      <w:r>
-        <w:t>TestResultado</w:t>
+        <w:t>`TestDefinicion`</w:t>
+      </w:r>
+    </w:p>
+    <w:p>
+      <w:pPr>
+        <w:pStyle w:val="ListBullet"/>
+      </w:pPr>
+      <w:r>
+        <w:t>`TestPregunta`</w:t>
+      </w:r>
+    </w:p>
+    <w:p>
+      <w:pPr>
+        <w:pStyle w:val="ListBullet"/>
+      </w:pPr>
+      <w:r>
+        <w:t>`TestAlternativa`</w:t>
+      </w:r>
+    </w:p>
+    <w:p>
+      <w:pPr>
+        <w:pStyle w:val="ListBullet"/>
+      </w:pPr>
+      <w:r>
+        <w:t>`TestEscala`</w:t>
+      </w:r>
+    </w:p>
+    <w:p>
+      <w:pPr>
+        <w:pStyle w:val="ListBullet"/>
+      </w:pPr>
+      <w:r>
+        <w:t>`TestReglaPuntuacion`</w:t>
+      </w:r>
+    </w:p>
+    <w:p>
+      <w:pPr>
+        <w:pStyle w:val="ListBullet"/>
+      </w:pPr>
+      <w:r>
+        <w:t>`TestAplicacion`</w:t>
+      </w:r>
+    </w:p>
+    <w:p>
+      <w:pPr>
+        <w:pStyle w:val="ListBullet"/>
+      </w:pPr>
+      <w:r>
+        <w:t>`TestRespuesta`</w:t>
+      </w:r>
+    </w:p>
+    <w:p>
+      <w:pPr>
+        <w:pStyle w:val="ListBullet"/>
+      </w:pPr>
+      <w:r>
+        <w:t>`TestResultado`</w:t>
       </w:r>
     </w:p>
     <w:p>
@@ -5819,7 +3916,7 @@
     </w:p>
     <w:p>
       <w:r>
-        <w:t>El chat actual usa max_tokens=2000, pero si se agregan informes largos y más contexto, el costo puede subir. Conviene guardar informes y resúmenes para no regenerar todo cada vez.</w:t>
+        <w:t>El chat actual usa `max_tokens=2000`, pero si se agregan informes largos y más contexto, el costo puede subir. Conviene guardar informes y resúmenes para no regenerar todo cada vez.</w:t>
       </w:r>
     </w:p>
     <w:p>
@@ -5832,12 +3929,12 @@
     </w:p>
     <w:p>
       <w:r>
-        <w:t>La aplicación actual ya tiene una base técnica fuerte: pacientes, sesiones, transcripción, voz, documentos externos separados, sesiones virtuales, chat IA y exportación PDF/Word. La reunión no indica que haya que cambiar de dirección, sino que muestra cómo convertir esa base en una plataforma mucho más valiosa para psicólogos reales.</w:t>
-      </w:r>
-    </w:p>
-    <w:p>
-      <w:r>
-        <w:t>Las ideas más importantes que actualmente no existen o siguen pendientes son tests digitalizados, consentimiento informado, agenda/pagos y analítica. La primera iteración ya incorporó ficha clínica avanzada, número de sesión automático, objetivos de intervención, prompt IA estructurado e informes IA persistentes.</w:t>
+        <w:t>La aplicación actual ya tiene una base técnica fuerte: pacientes, sesiones, transcripción, voz, documentos externos separados, sesiones virtuales, chat IA, tests psicológicos con enlace público y exportación PDF/Word. La reunión no indica que haya que cambiar de dirección, sino que muestra cómo convertir esa base en una plataforma mucho más valiosa para psicólogos reales.</w:t>
+      </w:r>
+    </w:p>
+    <w:p>
+      <w:r>
+        <w:t>Las ideas más importantes que siguen pendientes son consentimiento informado, agenda/pagos y analítica. La primera iteración incorporó ficha clínica avanzada, número de sesión automático, objetivos de intervención, prompt IA estructurado e informes IA persistentes; la segunda incorporó el primer test digitalizado con link público y resultado clínico asociado a la ficha.</w:t>
       </w:r>
     </w:p>
     <w:p>
@@ -5871,7 +3968,7 @@
         <w:pStyle w:val="ListBullet"/>
       </w:pPr>
       <w:r>
-        <w:t>Textos Sesión presencial y Sesión remota: implementado.</w:t>
+        <w:t>Textos `Sesión presencial` y `Sesión remota`: implementado.</w:t>
       </w:r>
     </w:p>
     <w:p>
@@ -5927,6 +4024,38 @@
         <w:pStyle w:val="ListBullet"/>
       </w:pPr>
       <w:r>
+        <w:t>Primer test digitalizado: implementado con Test de Creencias Ellis.</w:t>
+      </w:r>
+    </w:p>
+    <w:p>
+      <w:pPr>
+        <w:pStyle w:val="ListBullet"/>
+      </w:pPr>
+      <w:r>
+        <w:t>Link público para responder test sin autenticación: implementado con expiración de 7 días y uso único.</w:t>
+      </w:r>
+    </w:p>
+    <w:p>
+      <w:pPr>
+        <w:pStyle w:val="ListBullet"/>
+      </w:pPr>
+      <w:r>
+        <w:t>Resultados de test como sesión clínica y conocimiento para chat IA: implementado.</w:t>
+      </w:r>
+    </w:p>
+    <w:p>
+      <w:pPr>
+        <w:pStyle w:val="ListBullet"/>
+      </w:pPr>
+      <w:r>
+        <w:t>Correo automático para tests: preparado, pendiente de credenciales SMTP.</w:t>
+      </w:r>
+    </w:p>
+    <w:p>
+      <w:pPr>
+        <w:pStyle w:val="ListBullet"/>
+      </w:pPr>
+      <w:r>
         <w:t>Consentimiento informado básico: pendiente para etapa posterior.</w:t>
       </w:r>
     </w:p>
@@ -5935,15 +4064,7 @@
         <w:pStyle w:val="ListBullet"/>
       </w:pPr>
       <w:r>
-        <w:t>Diseñar primer modelo simple de tests.</w:t>
-      </w:r>
-    </w:p>
-    <w:p>
-      <w:pPr>
-        <w:pStyle w:val="ListBullet"/>
-      </w:pPr>
-      <w:r>
-        <w:t>Pedir a Lina los cuatro tests con preguntas, reglas y criterios.</w:t>
+        <w:t>Pedir a Lina los próximos tests con preguntas, reglas y criterios.</w:t>
       </w:r>
     </w:p>
     <w:p>
@@ -6327,10 +4448,6 @@
     <w:name w:val="Normal"/>
     <w:qFormat/>
     <w:rsid w:val="00FC693F"/>
-    <w:rPr>
-      <w:rFonts w:ascii="Calibri" w:hAnsi="Calibri"/>
-      <w:sz w:val="21"/>
-    </w:rPr>
   </w:style>
   <w:style w:type="paragraph" w:styleId="Header">
     <w:name w:val="header"/>

</xml_diff>